<commit_message>
Revised DocketParserAPIView and helper functions to handle court summaries; updated tests and documentation
</commit_message>
<xml_diff>
--- a/platform/src/petition/templates/petition/petition.docx
+++ b/platform/src/petition/templates/petition/petition.docx
@@ -1825,28 +1825,35 @@
       <w:proofErr w:type="spellStart"/>
       <w:r>
         <w:rPr>
+          <w:rFonts w:asciiTheme="minorHAnsi" w:eastAsia="Calibri" w:hAnsiTheme="minorHAnsi" w:cstheme="minorHAnsi"/>
+          <w:bCs/>
+        </w:rPr>
+        <w:t>petition.arrest_date</w:t>
+      </w:r>
+      <w:proofErr w:type="spellEnd"/>
+      <w:r>
+        <w:rPr>
           <w:rFonts w:asciiTheme="minorHAnsi" w:hAnsiTheme="minorHAnsi" w:cstheme="minorHAnsi"/>
         </w:rPr>
-        <w:t>petition.</w:t>
+        <w:t xml:space="preserve"> </w:t>
       </w:r>
       <w:r>
         <w:rPr>
           <w:rFonts w:asciiTheme="minorHAnsi" w:hAnsiTheme="minorHAnsi" w:cstheme="minorHAnsi"/>
         </w:rPr>
-        <w:t>arrest_date</w:t>
+        <w:t>|date</w:t>
       </w:r>
       <w:r>
         <w:rPr>
           <w:rFonts w:asciiTheme="minorHAnsi" w:hAnsiTheme="minorHAnsi" w:cstheme="minorHAnsi"/>
         </w:rPr>
-        <w:t>|date</w:t>
-      </w:r>
-      <w:proofErr w:type="spellEnd"/>
+        <w:t xml:space="preserve"> }}</w:t>
+      </w:r>
       <w:r>
         <w:rPr>
           <w:rFonts w:asciiTheme="minorHAnsi" w:hAnsiTheme="minorHAnsi" w:cstheme="minorHAnsi"/>
         </w:rPr>
-        <w:t xml:space="preserve"> }}</w:t>
+        <w:t>;</w:t>
       </w:r>
       <w:r>
         <w:rPr>
@@ -2326,7 +2333,6 @@
           <w:sz w:val="24"/>
           <w:szCs w:val="24"/>
         </w:rPr>
-        <w:lastRenderedPageBreak/>
         <w:t xml:space="preserve">{%p if </w:t>
       </w:r>
       <w:proofErr w:type="spellStart"/>
@@ -2391,6 +2397,7 @@
           <w:sz w:val="24"/>
           <w:szCs w:val="24"/>
         </w:rPr>
+        <w:lastRenderedPageBreak/>
         <w:t>If the sentence includes a fine, costs, or restitution, whether the amount due has been paid:</w:t>
       </w:r>
     </w:p>

</xml_diff>

<commit_message>
Revised petition template and backend to include arrest and complaint dates
</commit_message>
<xml_diff>
--- a/platform/src/petition/templates/petition/petition.docx
+++ b/platform/src/petition/templates/petition/petition.docx
@@ -1,6 +1,6 @@
 
 <file path=word/document.xml><?xml version="1.0" encoding="utf-8"?>
-<w:document xmlns:wpc="http://schemas.microsoft.com/office/word/2010/wordprocessingCanvas" xmlns:cx="http://schemas.microsoft.com/office/drawing/2014/chartex" xmlns:cx1="http://schemas.microsoft.com/office/drawing/2015/9/8/chartex" xmlns:cx2="http://schemas.microsoft.com/office/drawing/2015/10/21/chartex" xmlns:cx3="http://schemas.microsoft.com/office/drawing/2016/5/9/chartex" xmlns:cx4="http://schemas.microsoft.com/office/drawing/2016/5/10/chartex" xmlns:cx5="http://schemas.microsoft.com/office/drawing/2016/5/11/chartex" xmlns:cx6="http://schemas.microsoft.com/office/drawing/2016/5/12/chartex" xmlns:cx7="http://schemas.microsoft.com/office/drawing/2016/5/13/chartex" xmlns:cx8="http://schemas.microsoft.com/office/drawing/2016/5/14/chartex" xmlns:mc="http://schemas.openxmlformats.org/markup-compatibility/2006" xmlns:aink="http://schemas.microsoft.com/office/drawing/2016/ink" xmlns:am3d="http://schemas.microsoft.com/office/drawing/2017/model3d" xmlns:o="urn:schemas-microsoft-com:office:office" xmlns:oel="http://schemas.microsoft.com/office/2019/extlst" xmlns:r="http://schemas.openxmlformats.org/officeDocument/2006/relationships" xmlns:m="http://schemas.openxmlformats.org/officeDocument/2006/math" xmlns:v="urn:schemas-microsoft-com:vml" xmlns:wp14="http://schemas.microsoft.com/office/word/2010/wordprocessingDrawing" xmlns:wp="http://schemas.openxmlformats.org/drawingml/2006/wordprocessingDrawing" xmlns:w10="urn:schemas-microsoft-com:office:word" xmlns:w="http://schemas.openxmlformats.org/wordprocessingml/2006/main" xmlns:w14="http://schemas.microsoft.com/office/word/2010/wordml" xmlns:w15="http://schemas.microsoft.com/office/word/2012/wordml" xmlns:w16cex="http://schemas.microsoft.com/office/word/2018/wordml/cex" xmlns:w16cid="http://schemas.microsoft.com/office/word/2016/wordml/cid" xmlns:w16="http://schemas.microsoft.com/office/word/2018/wordml" xmlns:w16du="http://schemas.microsoft.com/office/word/2023/wordml/word16du" xmlns:w16sdtdh="http://schemas.microsoft.com/office/word/2020/wordml/sdtdatahash" xmlns:w16se="http://schemas.microsoft.com/office/word/2015/wordml/symex" xmlns:wpg="http://schemas.microsoft.com/office/word/2010/wordprocessingGroup" xmlns:wpi="http://schemas.microsoft.com/office/word/2010/wordprocessingInk" xmlns:wne="http://schemas.microsoft.com/office/word/2006/wordml" xmlns:wps="http://schemas.microsoft.com/office/word/2010/wordprocessingShape" mc:Ignorable="w14 w15 w16se w16cid w16 w16cex w16sdtdh w16du wp14">
+<w:document xmlns:wpc="http://schemas.microsoft.com/office/word/2010/wordprocessingCanvas" xmlns:cx="http://schemas.microsoft.com/office/drawing/2014/chartex" xmlns:cx1="http://schemas.microsoft.com/office/drawing/2015/9/8/chartex" xmlns:cx2="http://schemas.microsoft.com/office/drawing/2015/10/21/chartex" xmlns:cx3="http://schemas.microsoft.com/office/drawing/2016/5/9/chartex" xmlns:cx4="http://schemas.microsoft.com/office/drawing/2016/5/10/chartex" xmlns:cx5="http://schemas.microsoft.com/office/drawing/2016/5/11/chartex" xmlns:cx6="http://schemas.microsoft.com/office/drawing/2016/5/12/chartex" xmlns:cx7="http://schemas.microsoft.com/office/drawing/2016/5/13/chartex" xmlns:cx8="http://schemas.microsoft.com/office/drawing/2016/5/14/chartex" xmlns:mc="http://schemas.openxmlformats.org/markup-compatibility/2006" xmlns:aink="http://schemas.microsoft.com/office/drawing/2016/ink" xmlns:am3d="http://schemas.microsoft.com/office/drawing/2017/model3d" xmlns:o="urn:schemas-microsoft-com:office:office" xmlns:oel="http://schemas.microsoft.com/office/2019/extlst" xmlns:r="http://schemas.openxmlformats.org/officeDocument/2006/relationships" xmlns:m="http://schemas.openxmlformats.org/officeDocument/2006/math" xmlns:v="urn:schemas-microsoft-com:vml" xmlns:wp14="http://schemas.microsoft.com/office/word/2010/wordprocessingDrawing" xmlns:wp="http://schemas.openxmlformats.org/drawingml/2006/wordprocessingDrawing" xmlns:w10="urn:schemas-microsoft-com:office:word" xmlns:w="http://schemas.openxmlformats.org/wordprocessingml/2006/main" xmlns:w14="http://schemas.microsoft.com/office/word/2010/wordml" xmlns:w15="http://schemas.microsoft.com/office/word/2012/wordml" xmlns:w16cex="http://schemas.microsoft.com/office/word/2018/wordml/cex" xmlns:w16cid="http://schemas.microsoft.com/office/word/2016/wordml/cid" xmlns:w16="http://schemas.microsoft.com/office/word/2018/wordml" xmlns:w16du="http://schemas.microsoft.com/office/word/2023/wordml/word16du" xmlns:w16sdtdh="http://schemas.microsoft.com/office/word/2020/wordml/sdtdatahash" xmlns:w16sdtfl="http://schemas.microsoft.com/office/word/2024/wordml/sdtformatlock" xmlns:w16se="http://schemas.microsoft.com/office/word/2015/wordml/symex" xmlns:wpg="http://schemas.microsoft.com/office/word/2010/wordprocessingGroup" xmlns:wpi="http://schemas.microsoft.com/office/word/2010/wordprocessingInk" xmlns:wne="http://schemas.microsoft.com/office/word/2006/wordml" xmlns:wps="http://schemas.microsoft.com/office/word/2010/wordprocessingShape" mc:Ignorable="w14 w15 w16se w16cid w16 w16cex w16sdtdh w16sdtfl w16du wp14">
   <w:body>
     <w:p>
       <w:pPr>
@@ -14,22 +14,62 @@
       </w:r>
       <w:r>
         <w:br/>
-        <w:t>BY: {{ attorney.user.first_name }} {{ attorney.user.last_name }}</w:t>
+        <w:t xml:space="preserve">BY: {{ </w:t>
+      </w:r>
+      <w:proofErr w:type="spellStart"/>
+      <w:r>
+        <w:t>attorney.user.first_name</w:t>
+      </w:r>
+      <w:proofErr w:type="spellEnd"/>
+      <w:r>
+        <w:t xml:space="preserve"> }} {{ </w:t>
+      </w:r>
+      <w:proofErr w:type="spellStart"/>
+      <w:r>
+        <w:t>attorney.user.last_name</w:t>
+      </w:r>
+      <w:proofErr w:type="spellEnd"/>
+      <w:r>
+        <w:t xml:space="preserve"> }}</w:t>
       </w:r>
       <w:r>
         <w:br/>
-        <w:t>Identification No.: {{ attorney.bar }}</w:t>
+        <w:t xml:space="preserve">Identification No.: {{ </w:t>
+      </w:r>
+      <w:proofErr w:type="spellStart"/>
+      <w:r>
+        <w:t>attorney.bar</w:t>
+      </w:r>
+      <w:proofErr w:type="spellEnd"/>
+      <w:r>
+        <w:t xml:space="preserve"> }}</w:t>
       </w:r>
       <w:r>
         <w:br/>
       </w:r>
       <w:r>
         <w:br/>
-        <w:t>{{r organization.formattedAddress }}</w:t>
+        <w:t xml:space="preserve">{{r </w:t>
+      </w:r>
+      <w:proofErr w:type="spellStart"/>
+      <w:r>
+        <w:t>organization.formattedAddress</w:t>
+      </w:r>
+      <w:proofErr w:type="spellEnd"/>
+      <w:r>
+        <w:t xml:space="preserve"> }}</w:t>
       </w:r>
       <w:r>
         <w:br/>
-        <w:t>{{ organization.phone }}</w:t>
+        <w:t xml:space="preserve">{{ </w:t>
+      </w:r>
+      <w:proofErr w:type="spellStart"/>
+      <w:r>
+        <w:t>organization.phone</w:t>
+      </w:r>
+      <w:proofErr w:type="spellEnd"/>
+      <w:r>
+        <w:t xml:space="preserve"> }}</w:t>
       </w:r>
       <w:r>
         <w:br/>
@@ -146,7 +186,15 @@
               <w:jc w:val="center"/>
             </w:pPr>
             <w:r>
-              <w:t>{{r petitioner.formattedAddress }}</w:t>
+              <w:t xml:space="preserve">{{r </w:t>
+            </w:r>
+            <w:proofErr w:type="spellStart"/>
+            <w:r>
+              <w:t>petitioner.formattedAddress</w:t>
+            </w:r>
+            <w:proofErr w:type="spellEnd"/>
+            <w:r>
+              <w:t xml:space="preserve"> }}</w:t>
             </w:r>
           </w:p>
         </w:tc>
@@ -427,7 +475,15 @@
             <w:bookmarkStart w:id="1" w:name="_heading=h.30j0zll" w:colFirst="0" w:colLast="0"/>
             <w:bookmarkEnd w:id="1"/>
             <w:r>
-              <w:t>{% endfor -%}</w:t>
+              <w:t xml:space="preserve">{% </w:t>
+            </w:r>
+            <w:proofErr w:type="spellStart"/>
+            <w:r>
+              <w:t>endfor</w:t>
+            </w:r>
+            <w:proofErr w:type="spellEnd"/>
+            <w:r>
+              <w:t xml:space="preserve"> -%}</w:t>
             </w:r>
           </w:p>
           <w:p>
@@ -441,7 +497,15 @@
               <w:spacing w:after="0" w:line="240" w:lineRule="auto"/>
             </w:pPr>
             <w:r>
-              <w:t>OTN# {{ petition.otn }}</w:t>
+              <w:t xml:space="preserve">OTN# {{ </w:t>
+            </w:r>
+            <w:proofErr w:type="spellStart"/>
+            <w:r>
+              <w:t>petition.otn</w:t>
+            </w:r>
+            <w:proofErr w:type="spellEnd"/>
+            <w:r>
+              <w:t xml:space="preserve"> }}</w:t>
             </w:r>
           </w:p>
         </w:tc>
@@ -519,7 +583,39 @@
           <w:sz w:val="24"/>
           <w:szCs w:val="24"/>
         </w:rPr>
-        <w:t>AND NOW, this ____ day of ___________, 20__, after consideration of the Petition for {{ petition.ratio.value }} Pursuant to Pa.R.Crim.P. 790 presented by {{ petitioner.name }}, it is ORDERED that the Petition/Motion is _____________.</w:t>
+        <w:t xml:space="preserve">AND NOW, this ____ day of ___________, 20__, after consideration of the Petition for {{ </w:t>
+      </w:r>
+      <w:proofErr w:type="spellStart"/>
+      <w:r>
+        <w:rPr>
+          <w:sz w:val="24"/>
+          <w:szCs w:val="24"/>
+        </w:rPr>
+        <w:t>petition.ratio.value</w:t>
+      </w:r>
+      <w:proofErr w:type="spellEnd"/>
+      <w:r>
+        <w:rPr>
+          <w:sz w:val="24"/>
+          <w:szCs w:val="24"/>
+        </w:rPr>
+        <w:t xml:space="preserve"> }} Pursuant to </w:t>
+      </w:r>
+      <w:proofErr w:type="spellStart"/>
+      <w:r>
+        <w:rPr>
+          <w:sz w:val="24"/>
+          <w:szCs w:val="24"/>
+        </w:rPr>
+        <w:t>Pa.R.Crim.P</w:t>
+      </w:r>
+      <w:proofErr w:type="spellEnd"/>
+      <w:r>
+        <w:rPr>
+          <w:sz w:val="24"/>
+          <w:szCs w:val="24"/>
+        </w:rPr>
+        <w:t>. 790 presented by {{ petitioner.name }}, it is ORDERED that the Petition/Motion is _____________.</w:t>
       </w:r>
     </w:p>
     <w:p>
@@ -546,7 +642,23 @@
           <w:sz w:val="24"/>
           <w:szCs w:val="24"/>
         </w:rPr>
-        <w:t xml:space="preserve">All criminal justice agencies upon which this order is served shall expunge all criminal history record information from defendant’s arrest record pertaining to the charges below.  Criminal history record information includes information collected by criminal justice agencies concerning this individual and arising from the initiation of these criminal proceedings including but not limited to all fingerprints, photographs, identifiable descriptions, dates and notations of arrests, indictments, informations or other formal criminal charges, any dispositions arising from the above-captioned proceedings, and all electronic or digital records regarding any of the foregoing. </w:t>
+        <w:t xml:space="preserve">All criminal justice agencies upon which this order is served shall expunge all criminal history record information from defendant’s arrest record pertaining to the charges below.  Criminal history record information includes information collected by criminal justice agencies concerning this individual and arising from the initiation of these criminal proceedings including but not limited to all fingerprints, photographs, identifiable descriptions, dates and notations of arrests, indictments, </w:t>
+      </w:r>
+      <w:proofErr w:type="spellStart"/>
+      <w:r>
+        <w:rPr>
+          <w:sz w:val="24"/>
+          <w:szCs w:val="24"/>
+        </w:rPr>
+        <w:t>informations</w:t>
+      </w:r>
+      <w:proofErr w:type="spellEnd"/>
+      <w:r>
+        <w:rPr>
+          <w:sz w:val="24"/>
+          <w:szCs w:val="24"/>
+        </w:rPr>
+        <w:t xml:space="preserve"> or other formal criminal charges, any dispositions arising from the above-captioned proceedings, and all electronic or digital records regarding any of the foregoing. </w:t>
       </w:r>
     </w:p>
     <w:p>
@@ -600,7 +712,23 @@
           <w:sz w:val="24"/>
           <w:szCs w:val="24"/>
         </w:rPr>
-        <w:t>The information required under Pa.R.Crim.P. 790 appears on the attached page(s) which is hereby incorporated into this ORDER by reference.</w:t>
+        <w:t xml:space="preserve">The information required under </w:t>
+      </w:r>
+      <w:proofErr w:type="spellStart"/>
+      <w:r>
+        <w:rPr>
+          <w:sz w:val="24"/>
+          <w:szCs w:val="24"/>
+        </w:rPr>
+        <w:t>Pa.R.Crim.P</w:t>
+      </w:r>
+      <w:proofErr w:type="spellEnd"/>
+      <w:r>
+        <w:rPr>
+          <w:sz w:val="24"/>
+          <w:szCs w:val="24"/>
+        </w:rPr>
+        <w:t>. 790 appears on the attached page(s) which is hereby incorporated into this ORDER by reference.</w:t>
       </w:r>
     </w:p>
     <w:p>
@@ -738,7 +866,23 @@
           <w:sz w:val="24"/>
           <w:szCs w:val="24"/>
         </w:rPr>
-        <w:t>Pursuant to Pa.R.Crim.P. 790, the following information is provided:</w:t>
+        <w:t xml:space="preserve">Pursuant to </w:t>
+      </w:r>
+      <w:proofErr w:type="spellStart"/>
+      <w:r>
+        <w:rPr>
+          <w:sz w:val="24"/>
+          <w:szCs w:val="24"/>
+        </w:rPr>
+        <w:t>Pa.R.Crim.P</w:t>
+      </w:r>
+      <w:proofErr w:type="spellEnd"/>
+      <w:r>
+        <w:rPr>
+          <w:sz w:val="24"/>
+          <w:szCs w:val="24"/>
+        </w:rPr>
+        <w:t>. 790, the following information is provided:</w:t>
       </w:r>
     </w:p>
     <w:p>
@@ -841,7 +985,25 @@
           <w:sz w:val="24"/>
           <w:szCs w:val="24"/>
         </w:rPr>
-        <w:t xml:space="preserve"> {{ petitioner.aliases|comma_join }}</w:t>
+        <w:t xml:space="preserve"> {{ </w:t>
+      </w:r>
+      <w:proofErr w:type="spellStart"/>
+      <w:r>
+        <w:rPr>
+          <w:rFonts w:eastAsia="Calibri" w:cs="Calibri"/>
+          <w:sz w:val="24"/>
+          <w:szCs w:val="24"/>
+        </w:rPr>
+        <w:t>petitioner.aliases|comma_join</w:t>
+      </w:r>
+      <w:proofErr w:type="spellEnd"/>
+      <w:r>
+        <w:rPr>
+          <w:rFonts w:eastAsia="Calibri" w:cs="Calibri"/>
+          <w:sz w:val="24"/>
+          <w:szCs w:val="24"/>
+        </w:rPr>
+        <w:t xml:space="preserve"> }}</w:t>
       </w:r>
     </w:p>
     <w:p>
@@ -909,8 +1071,13 @@
         </w:rPr>
         <w:t xml:space="preserve">{{r </w:t>
       </w:r>
-      <w:r>
-        <w:t xml:space="preserve">petitioner.formattedAddress </w:t>
+      <w:proofErr w:type="spellStart"/>
+      <w:r>
+        <w:t>petitioner.formattedAddress</w:t>
+      </w:r>
+      <w:proofErr w:type="spellEnd"/>
+      <w:r>
+        <w:t xml:space="preserve"> </w:t>
       </w:r>
       <w:r>
         <w:rPr>
@@ -969,7 +1136,25 @@
           <w:sz w:val="24"/>
           <w:szCs w:val="24"/>
         </w:rPr>
-        <w:t xml:space="preserve"> {{ petitioner.dob|date }}</w:t>
+        <w:t xml:space="preserve"> {{ </w:t>
+      </w:r>
+      <w:proofErr w:type="spellStart"/>
+      <w:r>
+        <w:rPr>
+          <w:rFonts w:eastAsia="Calibri" w:cs="Calibri"/>
+          <w:sz w:val="24"/>
+          <w:szCs w:val="24"/>
+        </w:rPr>
+        <w:t>petitioner.dob|date</w:t>
+      </w:r>
+      <w:proofErr w:type="spellEnd"/>
+      <w:r>
+        <w:rPr>
+          <w:rFonts w:eastAsia="Calibri" w:cs="Calibri"/>
+          <w:sz w:val="24"/>
+          <w:szCs w:val="24"/>
+        </w:rPr>
+        <w:t xml:space="preserve"> }}</w:t>
       </w:r>
     </w:p>
     <w:p>
@@ -1026,7 +1211,25 @@
           <w:sz w:val="24"/>
           <w:szCs w:val="24"/>
         </w:rPr>
-        <w:t xml:space="preserve"> {{ petitioner.ssn }}</w:t>
+        <w:t xml:space="preserve"> {{ </w:t>
+      </w:r>
+      <w:proofErr w:type="spellStart"/>
+      <w:r>
+        <w:rPr>
+          <w:rFonts w:eastAsia="Calibri" w:cs="Calibri"/>
+          <w:sz w:val="24"/>
+          <w:szCs w:val="24"/>
+        </w:rPr>
+        <w:t>petitioner.ssn</w:t>
+      </w:r>
+      <w:proofErr w:type="spellEnd"/>
+      <w:r>
+        <w:rPr>
+          <w:rFonts w:eastAsia="Calibri" w:cs="Calibri"/>
+          <w:sz w:val="24"/>
+          <w:szCs w:val="24"/>
+        </w:rPr>
+        <w:t xml:space="preserve"> }}</w:t>
       </w:r>
     </w:p>
     <w:p>
@@ -1087,7 +1290,21 @@
         <w:rPr>
           <w:rFonts w:eastAsia="Calibri" w:cs="Calibri"/>
         </w:rPr>
-        <w:t>Judge {{ petition.judge }}</w:t>
+        <w:t xml:space="preserve">Judge {{ </w:t>
+      </w:r>
+      <w:proofErr w:type="spellStart"/>
+      <w:r>
+        <w:rPr>
+          <w:rFonts w:eastAsia="Calibri" w:cs="Calibri"/>
+        </w:rPr>
+        <w:t>petition.judge</w:t>
+      </w:r>
+      <w:proofErr w:type="spellEnd"/>
+      <w:r>
+        <w:rPr>
+          <w:rFonts w:eastAsia="Calibri" w:cs="Calibri"/>
+        </w:rPr>
+        <w:t xml:space="preserve"> }}</w:t>
       </w:r>
     </w:p>
     <w:p>
@@ -1174,7 +1391,92 @@
           <w:sz w:val="24"/>
           <w:szCs w:val="24"/>
         </w:rPr>
-        <w:t xml:space="preserve">Docket Number: </w:t>
+        <w:t>Name and mailing address of the affiant as shown on the complaint, if available</w:t>
+      </w:r>
+      <w:r>
+        <w:rPr>
+          <w:rFonts w:eastAsia="Calibri" w:cs="Calibri"/>
+          <w:b/>
+          <w:sz w:val="24"/>
+          <w:szCs w:val="24"/>
+        </w:rPr>
+        <w:t>:</w:t>
+      </w:r>
+    </w:p>
+    <w:p>
+      <w:pPr>
+        <w:spacing w:after="0" w:line="240" w:lineRule="auto"/>
+        <w:ind w:left="360"/>
+        <w:jc w:val="both"/>
+        <w:rPr>
+          <w:rFonts w:asciiTheme="minorHAnsi" w:hAnsiTheme="minorHAnsi" w:cstheme="minorHAnsi"/>
+        </w:rPr>
+      </w:pPr>
+      <w:r>
+        <w:rPr>
+          <w:rFonts w:asciiTheme="minorHAnsi" w:hAnsiTheme="minorHAnsi" w:cstheme="minorHAnsi"/>
+        </w:rPr>
+        <w:t>Philadelphia Police Dept, Philadelphia Police Dept, Philadelphia County, PA</w:t>
+      </w:r>
+    </w:p>
+    <w:p>
+      <w:pPr>
+        <w:pBdr>
+          <w:top w:val="nil"/>
+          <w:left w:val="nil"/>
+          <w:bottom w:val="nil"/>
+          <w:right w:val="nil"/>
+          <w:between w:val="nil"/>
+        </w:pBdr>
+        <w:spacing w:after="0" w:line="240" w:lineRule="auto"/>
+        <w:jc w:val="both"/>
+        <w:rPr>
+          <w:rFonts w:eastAsia="Calibri" w:cs="Calibri"/>
+          <w:b/>
+          <w:sz w:val="24"/>
+          <w:szCs w:val="24"/>
+        </w:rPr>
+      </w:pPr>
+      <w:r>
+        <w:rPr>
+          <w:rFonts w:eastAsia="Calibri" w:cs="Calibri"/>
+          <w:b/>
+          <w:sz w:val="24"/>
+          <w:szCs w:val="24"/>
+        </w:rPr>
+        <w:t xml:space="preserve"> </w:t>
+      </w:r>
+    </w:p>
+    <w:p>
+      <w:pPr>
+        <w:numPr>
+          <w:ilvl w:val="0"/>
+          <w:numId w:val="2"/>
+        </w:numPr>
+        <w:pBdr>
+          <w:top w:val="nil"/>
+          <w:left w:val="nil"/>
+          <w:bottom w:val="nil"/>
+          <w:right w:val="nil"/>
+          <w:between w:val="nil"/>
+        </w:pBdr>
+        <w:spacing w:after="0" w:line="240" w:lineRule="auto"/>
+        <w:jc w:val="both"/>
+        <w:rPr>
+          <w:rFonts w:eastAsia="Calibri" w:cs="Calibri"/>
+          <w:b/>
+          <w:sz w:val="24"/>
+          <w:szCs w:val="24"/>
+        </w:rPr>
+      </w:pPr>
+      <w:r>
+        <w:rPr>
+          <w:rFonts w:eastAsia="Calibri" w:cs="Calibri"/>
+          <w:b/>
+          <w:sz w:val="24"/>
+          <w:szCs w:val="24"/>
+        </w:rPr>
+        <w:t>Docket Number:</w:t>
       </w:r>
     </w:p>
     <w:tbl>
@@ -1275,7 +1577,15 @@
               <w:ind w:left="-18" w:right="-20"/>
             </w:pPr>
             <w:r>
-              <w:t>{%tr endfor %}</w:t>
+              <w:t xml:space="preserve">{%tr </w:t>
+            </w:r>
+            <w:proofErr w:type="spellStart"/>
+            <w:r>
+              <w:t>endfor</w:t>
+            </w:r>
+            <w:proofErr w:type="spellEnd"/>
+            <w:r>
+              <w:t xml:space="preserve"> %}</w:t>
             </w:r>
           </w:p>
         </w:tc>
@@ -1314,12 +1624,12 @@
         <w:spacing w:after="0" w:line="240" w:lineRule="auto"/>
         <w:jc w:val="both"/>
         <w:rPr>
-          <w:rFonts w:eastAsia="Calibri" w:cs="Calibri"/>
-        </w:rPr>
-      </w:pPr>
-      <w:r>
-        <w:rPr>
-          <w:rFonts w:eastAsia="Calibri" w:cs="Calibri"/>
+          <w:rFonts w:asciiTheme="minorHAnsi" w:eastAsia="Calibri" w:hAnsiTheme="minorHAnsi" w:cstheme="minorHAnsi"/>
+        </w:rPr>
+      </w:pPr>
+      <w:r>
+        <w:rPr>
+          <w:rFonts w:asciiTheme="minorHAnsi" w:eastAsia="Calibri" w:hAnsiTheme="minorHAnsi" w:cstheme="minorHAnsi"/>
           <w:b/>
           <w:sz w:val="24"/>
           <w:szCs w:val="24"/>
@@ -1328,17 +1638,46 @@
       </w:r>
       <w:r>
         <w:rPr>
-          <w:rFonts w:eastAsia="Calibri" w:cs="Calibri"/>
-          <w:sz w:val="24"/>
-          <w:szCs w:val="24"/>
-        </w:rPr>
-        <w:t xml:space="preserve"> {{ petition.otn }}</w:t>
-      </w:r>
-    </w:p>
-    <w:p>
-      <w:pPr>
-        <w:spacing w:after="0" w:line="240" w:lineRule="auto"/>
+          <w:rFonts w:asciiTheme="minorHAnsi" w:eastAsia="Calibri" w:hAnsiTheme="minorHAnsi" w:cstheme="minorHAnsi"/>
+          <w:sz w:val="24"/>
+          <w:szCs w:val="24"/>
+        </w:rPr>
+        <w:t xml:space="preserve"> {{ </w:t>
+      </w:r>
+      <w:proofErr w:type="spellStart"/>
+      <w:r>
+        <w:rPr>
+          <w:rFonts w:asciiTheme="minorHAnsi" w:eastAsia="Calibri" w:hAnsiTheme="minorHAnsi" w:cstheme="minorHAnsi"/>
+          <w:sz w:val="24"/>
+          <w:szCs w:val="24"/>
+        </w:rPr>
+        <w:t>petition.otn</w:t>
+      </w:r>
+      <w:proofErr w:type="spellEnd"/>
+      <w:r>
+        <w:rPr>
+          <w:rFonts w:asciiTheme="minorHAnsi" w:eastAsia="Calibri" w:hAnsiTheme="minorHAnsi" w:cstheme="minorHAnsi"/>
+          <w:sz w:val="24"/>
+          <w:szCs w:val="24"/>
+        </w:rPr>
+        <w:t xml:space="preserve"> }}</w:t>
+      </w:r>
+    </w:p>
+    <w:p>
+      <w:pPr>
+        <w:pBdr>
+          <w:top w:val="nil"/>
+          <w:left w:val="nil"/>
+          <w:bottom w:val="nil"/>
+          <w:right w:val="nil"/>
+          <w:between w:val="nil"/>
+        </w:pBdr>
+        <w:spacing w:after="0" w:line="240" w:lineRule="auto"/>
+        <w:ind w:left="360"/>
         <w:jc w:val="both"/>
+        <w:rPr>
+          <w:rFonts w:asciiTheme="minorHAnsi" w:eastAsia="Calibri" w:hAnsiTheme="minorHAnsi" w:cstheme="minorHAnsi"/>
+        </w:rPr>
       </w:pPr>
     </w:p>
     <w:p>
@@ -1357,368 +1696,203 @@
         <w:spacing w:after="0" w:line="240" w:lineRule="auto"/>
         <w:jc w:val="both"/>
         <w:rPr>
-          <w:rFonts w:eastAsia="Calibri" w:cs="Calibri"/>
-        </w:rPr>
-      </w:pPr>
-      <w:r>
-        <w:rPr>
-          <w:rFonts w:eastAsia="Calibri" w:cs="Calibri"/>
+          <w:rFonts w:asciiTheme="minorHAnsi" w:eastAsia="Calibri" w:hAnsiTheme="minorHAnsi" w:cstheme="minorHAnsi"/>
+        </w:rPr>
+      </w:pPr>
+      <w:r>
+        <w:rPr>
+          <w:rFonts w:asciiTheme="minorHAnsi" w:eastAsia="Calibri" w:hAnsiTheme="minorHAnsi" w:cstheme="minorHAnsi"/>
           <w:b/>
           <w:sz w:val="24"/>
           <w:szCs w:val="24"/>
         </w:rPr>
-        <w:t>The specific charges, as they appear on the charging document, to be expunged and applicable dispositions:</w:t>
-      </w:r>
-    </w:p>
-    <w:tbl>
-      <w:tblPr>
-        <w:tblW w:w="10779" w:type="dxa"/>
-        <w:tblInd w:w="-621" w:type="dxa"/>
-        <w:tblLayout w:type="fixed"/>
-        <w:tblLook w:val="0000" w:firstRow="0" w:lastRow="0" w:firstColumn="0" w:lastColumn="0" w:noHBand="0" w:noVBand="0"/>
-      </w:tblPr>
-      <w:tblGrid>
-        <w:gridCol w:w="2049"/>
-        <w:gridCol w:w="2966"/>
-        <w:gridCol w:w="814"/>
-        <w:gridCol w:w="1525"/>
-        <w:gridCol w:w="3425"/>
-      </w:tblGrid>
-      <w:tr>
-        <w:tc>
-          <w:tcPr>
-            <w:tcW w:w="2049" w:type="dxa"/>
-            <w:tcBorders>
-              <w:top w:val="single" w:sz="4" w:space="0" w:color="000001"/>
-              <w:left w:val="single" w:sz="4" w:space="0" w:color="000001"/>
-              <w:bottom w:val="single" w:sz="4" w:space="0" w:color="000001"/>
-              <w:right w:val="single" w:sz="4" w:space="0" w:color="000001"/>
-            </w:tcBorders>
-            <w:shd w:val="clear" w:color="auto" w:fill="auto"/>
-          </w:tcPr>
-          <w:p>
-            <w:pPr>
-              <w:widowControl w:val="0"/>
-              <w:spacing w:before="1" w:after="0" w:line="240" w:lineRule="auto"/>
-              <w:ind w:left="102" w:right="-20"/>
-            </w:pPr>
-            <w:r>
-              <w:rPr>
-                <w:b/>
-              </w:rPr>
-              <w:t>Code Section</w:t>
-            </w:r>
-          </w:p>
-        </w:tc>
-        <w:tc>
-          <w:tcPr>
-            <w:tcW w:w="2966" w:type="dxa"/>
-            <w:tcBorders>
-              <w:top w:val="single" w:sz="4" w:space="0" w:color="000001"/>
-              <w:left w:val="single" w:sz="4" w:space="0" w:color="000001"/>
-              <w:bottom w:val="single" w:sz="4" w:space="0" w:color="000001"/>
-              <w:right w:val="single" w:sz="4" w:space="0" w:color="000001"/>
-            </w:tcBorders>
-            <w:shd w:val="clear" w:color="auto" w:fill="auto"/>
-          </w:tcPr>
-          <w:p>
-            <w:pPr>
-              <w:widowControl w:val="0"/>
-              <w:spacing w:after="0" w:line="240" w:lineRule="auto"/>
-              <w:ind w:left="102" w:right="-20"/>
-            </w:pPr>
-            <w:r>
-              <w:rPr>
-                <w:b/>
-              </w:rPr>
-              <w:t>Statute Description</w:t>
-            </w:r>
-          </w:p>
-        </w:tc>
-        <w:tc>
-          <w:tcPr>
-            <w:tcW w:w="814" w:type="dxa"/>
-            <w:tcBorders>
-              <w:top w:val="single" w:sz="4" w:space="0" w:color="000001"/>
-              <w:left w:val="single" w:sz="4" w:space="0" w:color="000001"/>
-              <w:bottom w:val="single" w:sz="4" w:space="0" w:color="000001"/>
-              <w:right w:val="single" w:sz="4" w:space="0" w:color="000001"/>
-            </w:tcBorders>
-            <w:shd w:val="clear" w:color="auto" w:fill="auto"/>
-          </w:tcPr>
-          <w:p>
-            <w:pPr>
-              <w:widowControl w:val="0"/>
-              <w:spacing w:after="0" w:line="240" w:lineRule="auto"/>
-              <w:ind w:left="100" w:right="-20"/>
-              <w:jc w:val="both"/>
-            </w:pPr>
-            <w:r>
-              <w:rPr>
-                <w:b/>
-              </w:rPr>
-              <w:t>Grade</w:t>
-            </w:r>
-          </w:p>
-        </w:tc>
-        <w:tc>
-          <w:tcPr>
-            <w:tcW w:w="1525" w:type="dxa"/>
-            <w:tcBorders>
-              <w:top w:val="single" w:sz="4" w:space="0" w:color="000001"/>
-              <w:left w:val="single" w:sz="4" w:space="0" w:color="000001"/>
-              <w:bottom w:val="single" w:sz="4" w:space="0" w:color="000001"/>
-              <w:right w:val="single" w:sz="4" w:space="0" w:color="000001"/>
-            </w:tcBorders>
-            <w:shd w:val="clear" w:color="auto" w:fill="auto"/>
-          </w:tcPr>
-          <w:p>
-            <w:pPr>
-              <w:widowControl w:val="0"/>
-              <w:spacing w:after="0" w:line="240" w:lineRule="auto"/>
-              <w:ind w:left="100" w:right="-20"/>
-              <w:jc w:val="both"/>
-              <w:rPr>
-                <w:b/>
-              </w:rPr>
-            </w:pPr>
-            <w:r>
-              <w:rPr>
-                <w:b/>
-              </w:rPr>
-              <w:t>Disp Date</w:t>
-            </w:r>
-          </w:p>
-        </w:tc>
-        <w:tc>
-          <w:tcPr>
-            <w:tcW w:w="3425" w:type="dxa"/>
-            <w:tcBorders>
-              <w:top w:val="single" w:sz="4" w:space="0" w:color="000001"/>
-              <w:left w:val="single" w:sz="4" w:space="0" w:color="000001"/>
-              <w:bottom w:val="single" w:sz="4" w:space="0" w:color="000001"/>
-              <w:right w:val="single" w:sz="4" w:space="0" w:color="000001"/>
-            </w:tcBorders>
-            <w:shd w:val="clear" w:color="auto" w:fill="auto"/>
-          </w:tcPr>
-          <w:p>
-            <w:pPr>
-              <w:widowControl w:val="0"/>
-              <w:spacing w:after="0" w:line="240" w:lineRule="auto"/>
-              <w:ind w:left="100" w:right="-20"/>
-            </w:pPr>
-            <w:r>
-              <w:rPr>
-                <w:b/>
-              </w:rPr>
-              <w:t>Disposition</w:t>
-            </w:r>
-          </w:p>
-        </w:tc>
-      </w:tr>
-      <w:tr>
-        <w:trPr>
-          <w:cantSplit/>
-          <w:trHeight w:val="259"/>
-        </w:trPr>
-        <w:tc>
-          <w:tcPr>
-            <w:tcW w:w="10779" w:type="dxa"/>
-            <w:gridSpan w:val="5"/>
-            <w:tcBorders>
-              <w:top w:val="single" w:sz="4" w:space="0" w:color="000001"/>
-              <w:left w:val="single" w:sz="4" w:space="0" w:color="000001"/>
-              <w:bottom w:val="single" w:sz="4" w:space="0" w:color="000001"/>
-              <w:right w:val="single" w:sz="4" w:space="0" w:color="000001"/>
-            </w:tcBorders>
-            <w:shd w:val="clear" w:color="auto" w:fill="auto"/>
-          </w:tcPr>
-          <w:p>
-            <w:pPr>
-              <w:widowControl w:val="0"/>
-              <w:spacing w:after="0" w:line="240" w:lineRule="auto"/>
-              <w:ind w:left="100" w:right="-20"/>
-            </w:pPr>
-            <w:r>
-              <w:t>{%tr for charge in charges %}</w:t>
-            </w:r>
-          </w:p>
-        </w:tc>
-      </w:tr>
-      <w:tr>
-        <w:trPr>
-          <w:cantSplit/>
-          <w:trHeight w:val="259"/>
-        </w:trPr>
-        <w:tc>
-          <w:tcPr>
-            <w:tcW w:w="2049" w:type="dxa"/>
-            <w:tcBorders>
-              <w:top w:val="single" w:sz="4" w:space="0" w:color="000001"/>
-              <w:left w:val="single" w:sz="4" w:space="0" w:color="000001"/>
-              <w:bottom w:val="single" w:sz="4" w:space="0" w:color="000001"/>
-              <w:right w:val="single" w:sz="4" w:space="0" w:color="000001"/>
-            </w:tcBorders>
-            <w:shd w:val="clear" w:color="auto" w:fill="auto"/>
-          </w:tcPr>
-          <w:p>
-            <w:pPr>
-              <w:widowControl w:val="0"/>
-              <w:spacing w:after="0" w:line="240" w:lineRule="auto"/>
-              <w:ind w:left="100" w:right="-20"/>
-            </w:pPr>
-            <w:r>
-              <w:t>{{ charge.statute }}</w:t>
-            </w:r>
-          </w:p>
-        </w:tc>
-        <w:tc>
-          <w:tcPr>
-            <w:tcW w:w="2966" w:type="dxa"/>
-            <w:tcBorders>
-              <w:top w:val="single" w:sz="4" w:space="0" w:color="000001"/>
-              <w:left w:val="single" w:sz="4" w:space="0" w:color="000001"/>
-              <w:bottom w:val="single" w:sz="4" w:space="0" w:color="000001"/>
-              <w:right w:val="single" w:sz="4" w:space="0" w:color="000001"/>
-            </w:tcBorders>
-            <w:shd w:val="clear" w:color="auto" w:fill="auto"/>
-          </w:tcPr>
-          <w:p>
-            <w:pPr>
-              <w:widowControl w:val="0"/>
-              <w:spacing w:after="0" w:line="240" w:lineRule="auto"/>
-              <w:ind w:left="100" w:right="-20"/>
-            </w:pPr>
-            <w:r>
-              <w:t>{{ charge.description }}</w:t>
-            </w:r>
-          </w:p>
-        </w:tc>
-        <w:tc>
-          <w:tcPr>
-            <w:tcW w:w="814" w:type="dxa"/>
-            <w:tcBorders>
-              <w:top w:val="single" w:sz="4" w:space="0" w:color="000001"/>
-              <w:left w:val="single" w:sz="4" w:space="0" w:color="000001"/>
-              <w:bottom w:val="single" w:sz="4" w:space="0" w:color="000001"/>
-              <w:right w:val="single" w:sz="4" w:space="0" w:color="000001"/>
-            </w:tcBorders>
-            <w:shd w:val="clear" w:color="auto" w:fill="auto"/>
-          </w:tcPr>
-          <w:p>
-            <w:pPr>
-              <w:widowControl w:val="0"/>
-              <w:spacing w:after="0" w:line="240" w:lineRule="auto"/>
-              <w:ind w:left="100" w:right="-20"/>
-            </w:pPr>
-            <w:r>
-              <w:t>{{ charge.grade }}</w:t>
-            </w:r>
-          </w:p>
-        </w:tc>
-        <w:tc>
-          <w:tcPr>
-            <w:tcW w:w="1525" w:type="dxa"/>
-            <w:tcBorders>
-              <w:top w:val="single" w:sz="4" w:space="0" w:color="000001"/>
-              <w:left w:val="single" w:sz="4" w:space="0" w:color="000001"/>
-              <w:bottom w:val="single" w:sz="4" w:space="0" w:color="000001"/>
-              <w:right w:val="single" w:sz="4" w:space="0" w:color="000001"/>
-            </w:tcBorders>
-            <w:shd w:val="clear" w:color="auto" w:fill="auto"/>
-          </w:tcPr>
-          <w:p>
-            <w:pPr>
-              <w:widowControl w:val="0"/>
-              <w:spacing w:after="0" w:line="240" w:lineRule="auto"/>
-              <w:ind w:left="100" w:right="-20"/>
-            </w:pPr>
-            <w:r>
-              <w:t>{{ charge.date|date }}</w:t>
-            </w:r>
-          </w:p>
-        </w:tc>
-        <w:tc>
-          <w:tcPr>
-            <w:tcW w:w="3425" w:type="dxa"/>
-            <w:tcBorders>
-              <w:top w:val="single" w:sz="4" w:space="0" w:color="000001"/>
-              <w:left w:val="single" w:sz="4" w:space="0" w:color="000001"/>
-              <w:bottom w:val="single" w:sz="4" w:space="0" w:color="000001"/>
-              <w:right w:val="single" w:sz="4" w:space="0" w:color="000001"/>
-            </w:tcBorders>
-            <w:shd w:val="clear" w:color="auto" w:fill="auto"/>
-          </w:tcPr>
-          <w:p>
-            <w:pPr>
-              <w:widowControl w:val="0"/>
-              <w:spacing w:after="0" w:line="240" w:lineRule="auto"/>
-              <w:ind w:left="100" w:right="-20"/>
-            </w:pPr>
-            <w:r>
-              <w:t>{{ charge.disposition }}</w:t>
-            </w:r>
-          </w:p>
-        </w:tc>
-      </w:tr>
-      <w:tr>
-        <w:trPr>
-          <w:cantSplit/>
-          <w:trHeight w:val="259"/>
-        </w:trPr>
-        <w:tc>
-          <w:tcPr>
-            <w:tcW w:w="10779" w:type="dxa"/>
-            <w:gridSpan w:val="5"/>
-            <w:tcBorders>
-              <w:top w:val="single" w:sz="4" w:space="0" w:color="000001"/>
-              <w:left w:val="single" w:sz="4" w:space="0" w:color="000001"/>
-              <w:bottom w:val="single" w:sz="4" w:space="0" w:color="000001"/>
-              <w:right w:val="single" w:sz="4" w:space="0" w:color="000001"/>
-            </w:tcBorders>
-            <w:shd w:val="clear" w:color="auto" w:fill="auto"/>
-          </w:tcPr>
-          <w:p>
-            <w:pPr>
-              <w:widowControl w:val="0"/>
-              <w:spacing w:after="0" w:line="240" w:lineRule="auto"/>
-              <w:ind w:left="100" w:right="-20"/>
-            </w:pPr>
-            <w:r>
-              <w:t>{%tr endfor %}</w:t>
-            </w:r>
-          </w:p>
-        </w:tc>
-      </w:tr>
-    </w:tbl>
+        <w:t>The date on the complaint, or the date of arrest, and if available, the criminal justice agency that made the arrest:</w:t>
+      </w:r>
+      <w:r>
+        <w:rPr>
+          <w:rFonts w:asciiTheme="minorHAnsi" w:eastAsia="Calibri" w:hAnsiTheme="minorHAnsi" w:cstheme="minorHAnsi"/>
+          <w:bCs/>
+          <w:sz w:val="24"/>
+          <w:szCs w:val="24"/>
+        </w:rPr>
+        <w:t xml:space="preserve"> </w:t>
+      </w:r>
+      <w:r>
+        <w:rPr>
+          <w:rFonts w:asciiTheme="minorHAnsi" w:eastAsia="Calibri" w:hAnsiTheme="minorHAnsi" w:cstheme="minorHAnsi"/>
+          <w:bCs/>
+        </w:rPr>
+        <w:t xml:space="preserve">{% if </w:t>
+      </w:r>
+      <w:proofErr w:type="spellStart"/>
+      <w:r>
+        <w:rPr>
+          <w:rFonts w:asciiTheme="minorHAnsi" w:eastAsia="Calibri" w:hAnsiTheme="minorHAnsi" w:cstheme="minorHAnsi"/>
+          <w:bCs/>
+        </w:rPr>
+        <w:t>petition.</w:t>
+      </w:r>
+      <w:r>
+        <w:rPr>
+          <w:rFonts w:asciiTheme="minorHAnsi" w:eastAsia="Calibri" w:hAnsiTheme="minorHAnsi" w:cstheme="minorHAnsi"/>
+          <w:bCs/>
+        </w:rPr>
+        <w:t>complaint_date</w:t>
+      </w:r>
+      <w:proofErr w:type="spellEnd"/>
+      <w:r>
+        <w:rPr>
+          <w:rFonts w:asciiTheme="minorHAnsi" w:eastAsia="Calibri" w:hAnsiTheme="minorHAnsi" w:cstheme="minorHAnsi"/>
+          <w:bCs/>
+        </w:rPr>
+        <w:t xml:space="preserve"> %}Complaint Date: {{ </w:t>
+      </w:r>
+      <w:proofErr w:type="spellStart"/>
+      <w:r>
+        <w:rPr>
+          <w:rFonts w:asciiTheme="minorHAnsi" w:eastAsia="Calibri" w:hAnsiTheme="minorHAnsi" w:cstheme="minorHAnsi"/>
+          <w:bCs/>
+        </w:rPr>
+        <w:t>petition.</w:t>
+      </w:r>
+      <w:r>
+        <w:rPr>
+          <w:rFonts w:asciiTheme="minorHAnsi" w:eastAsia="Calibri" w:hAnsiTheme="minorHAnsi" w:cstheme="minorHAnsi"/>
+          <w:bCs/>
+        </w:rPr>
+        <w:t>complaint_date</w:t>
+      </w:r>
+      <w:r>
+        <w:rPr>
+          <w:rFonts w:asciiTheme="minorHAnsi" w:eastAsia="Calibri" w:hAnsiTheme="minorHAnsi" w:cstheme="minorHAnsi"/>
+          <w:bCs/>
+        </w:rPr>
+        <w:t>|date</w:t>
+      </w:r>
+      <w:proofErr w:type="spellEnd"/>
+      <w:r>
+        <w:rPr>
+          <w:rFonts w:asciiTheme="minorHAnsi" w:eastAsia="Calibri" w:hAnsiTheme="minorHAnsi" w:cstheme="minorHAnsi"/>
+          <w:bCs/>
+        </w:rPr>
+        <w:t xml:space="preserve"> }}; {% </w:t>
+      </w:r>
+      <w:proofErr w:type="spellStart"/>
+      <w:r>
+        <w:rPr>
+          <w:rFonts w:asciiTheme="minorHAnsi" w:eastAsia="Calibri" w:hAnsiTheme="minorHAnsi" w:cstheme="minorHAnsi"/>
+          <w:bCs/>
+        </w:rPr>
+        <w:t>el</w:t>
+      </w:r>
+      <w:r>
+        <w:rPr>
+          <w:rFonts w:asciiTheme="minorHAnsi" w:eastAsia="Calibri" w:hAnsiTheme="minorHAnsi" w:cstheme="minorHAnsi"/>
+          <w:bCs/>
+        </w:rPr>
+        <w:t>if</w:t>
+      </w:r>
+      <w:proofErr w:type="spellEnd"/>
+      <w:r>
+        <w:rPr>
+          <w:rFonts w:asciiTheme="minorHAnsi" w:eastAsia="Calibri" w:hAnsiTheme="minorHAnsi" w:cstheme="minorHAnsi"/>
+          <w:bCs/>
+        </w:rPr>
+        <w:t xml:space="preserve"> </w:t>
+      </w:r>
+      <w:proofErr w:type="spellStart"/>
+      <w:r>
+        <w:rPr>
+          <w:rFonts w:asciiTheme="minorHAnsi" w:eastAsia="Calibri" w:hAnsiTheme="minorHAnsi" w:cstheme="minorHAnsi"/>
+          <w:bCs/>
+        </w:rPr>
+        <w:t>petition.arrest_date</w:t>
+      </w:r>
+      <w:proofErr w:type="spellEnd"/>
+      <w:r>
+        <w:rPr>
+          <w:rFonts w:asciiTheme="minorHAnsi" w:eastAsia="Calibri" w:hAnsiTheme="minorHAnsi" w:cstheme="minorHAnsi"/>
+          <w:bCs/>
+        </w:rPr>
+        <w:t xml:space="preserve"> %}</w:t>
+      </w:r>
+      <w:r>
+        <w:rPr>
+          <w:rFonts w:asciiTheme="minorHAnsi" w:hAnsiTheme="minorHAnsi" w:cstheme="minorHAnsi"/>
+        </w:rPr>
+        <w:t xml:space="preserve">Arrest Date: {{ </w:t>
+      </w:r>
+      <w:proofErr w:type="spellStart"/>
+      <w:r>
+        <w:rPr>
+          <w:rFonts w:asciiTheme="minorHAnsi" w:hAnsiTheme="minorHAnsi" w:cstheme="minorHAnsi"/>
+        </w:rPr>
+        <w:t>petition.</w:t>
+      </w:r>
+      <w:r>
+        <w:rPr>
+          <w:rFonts w:asciiTheme="minorHAnsi" w:hAnsiTheme="minorHAnsi" w:cstheme="minorHAnsi"/>
+        </w:rPr>
+        <w:t>arrest_date</w:t>
+      </w:r>
+      <w:r>
+        <w:rPr>
+          <w:rFonts w:asciiTheme="minorHAnsi" w:hAnsiTheme="minorHAnsi" w:cstheme="minorHAnsi"/>
+        </w:rPr>
+        <w:t>|date</w:t>
+      </w:r>
+      <w:proofErr w:type="spellEnd"/>
+      <w:r>
+        <w:rPr>
+          <w:rFonts w:asciiTheme="minorHAnsi" w:hAnsiTheme="minorHAnsi" w:cstheme="minorHAnsi"/>
+        </w:rPr>
+        <w:t xml:space="preserve"> }}</w:t>
+      </w:r>
+      <w:r>
+        <w:rPr>
+          <w:rFonts w:asciiTheme="minorHAnsi" w:hAnsiTheme="minorHAnsi" w:cstheme="minorHAnsi"/>
+        </w:rPr>
+        <w:t xml:space="preserve"> {% else %}</w:t>
+      </w:r>
+      <w:r>
+        <w:rPr>
+          <w:rFonts w:asciiTheme="minorHAnsi" w:hAnsiTheme="minorHAnsi" w:cstheme="minorHAnsi"/>
+        </w:rPr>
+        <w:t xml:space="preserve">Complaint Date: </w:t>
+      </w:r>
+      <w:r>
+        <w:rPr>
+          <w:rFonts w:asciiTheme="minorHAnsi" w:hAnsiTheme="minorHAnsi" w:cstheme="minorHAnsi"/>
+        </w:rPr>
+        <w:t>N/A</w:t>
+      </w:r>
+      <w:r>
+        <w:rPr>
+          <w:rFonts w:asciiTheme="minorHAnsi" w:hAnsiTheme="minorHAnsi" w:cstheme="minorHAnsi"/>
+        </w:rPr>
+        <w:t xml:space="preserve">; </w:t>
+      </w:r>
+      <w:r>
+        <w:rPr>
+          <w:rFonts w:asciiTheme="minorHAnsi" w:hAnsiTheme="minorHAnsi" w:cstheme="minorHAnsi"/>
+        </w:rPr>
+        <w:t xml:space="preserve">{% endif %} </w:t>
+      </w:r>
+      <w:r>
+        <w:rPr>
+          <w:rFonts w:asciiTheme="minorHAnsi" w:hAnsiTheme="minorHAnsi" w:cstheme="minorHAnsi"/>
+        </w:rPr>
+        <w:t>Arresting Agency: Philadelphia Police Dept</w:t>
+      </w:r>
+    </w:p>
     <w:p>
       <w:pPr>
         <w:spacing w:after="0" w:line="240" w:lineRule="auto"/>
         <w:jc w:val="both"/>
         <w:rPr>
-          <w:b/>
-          <w:sz w:val="24"/>
-          <w:szCs w:val="24"/>
-        </w:rPr>
-      </w:pPr>
-    </w:p>
-    <w:p>
-      <w:pPr>
-        <w:spacing w:after="0" w:line="240" w:lineRule="auto"/>
-        <w:jc w:val="both"/>
-        <w:rPr>
-          <w:b/>
-          <w:sz w:val="24"/>
-          <w:szCs w:val="24"/>
-        </w:rPr>
-      </w:pPr>
-      <w:r>
-        <w:rPr>
-          <w:sz w:val="24"/>
-          <w:szCs w:val="24"/>
-        </w:rPr>
-        <w:t>{%p if fines.total and fines.paid %}</w:t>
-      </w:r>
+          <w:rFonts w:asciiTheme="minorHAnsi" w:hAnsiTheme="minorHAnsi" w:cstheme="minorHAnsi"/>
+        </w:rPr>
+      </w:pPr>
     </w:p>
     <w:p>
       <w:pPr>
@@ -1736,6 +1910,474 @@
         <w:spacing w:after="0" w:line="240" w:lineRule="auto"/>
         <w:jc w:val="both"/>
         <w:rPr>
+          <w:rFonts w:asciiTheme="minorHAnsi" w:eastAsia="Calibri" w:hAnsiTheme="minorHAnsi" w:cstheme="minorHAnsi"/>
+        </w:rPr>
+      </w:pPr>
+      <w:r>
+        <w:rPr>
+          <w:rFonts w:asciiTheme="minorHAnsi" w:eastAsia="Calibri" w:hAnsiTheme="minorHAnsi" w:cstheme="minorHAnsi"/>
+          <w:b/>
+          <w:sz w:val="24"/>
+          <w:szCs w:val="24"/>
+        </w:rPr>
+        <w:t>The specific charges, as they appear on the charging document, to be expunged and applicable dispositions:</w:t>
+      </w:r>
+    </w:p>
+    <w:tbl>
+      <w:tblPr>
+        <w:tblW w:w="10696" w:type="dxa"/>
+        <w:tblInd w:w="-621" w:type="dxa"/>
+        <w:tblLayout w:type="fixed"/>
+        <w:tblLook w:val="0000" w:firstRow="0" w:lastRow="0" w:firstColumn="0" w:lastColumn="0" w:noHBand="0" w:noVBand="0"/>
+      </w:tblPr>
+      <w:tblGrid>
+        <w:gridCol w:w="1876"/>
+        <w:gridCol w:w="2970"/>
+        <w:gridCol w:w="900"/>
+        <w:gridCol w:w="1530"/>
+        <w:gridCol w:w="3420"/>
+      </w:tblGrid>
+      <w:tr>
+        <w:tc>
+          <w:tcPr>
+            <w:tcW w:w="1876" w:type="dxa"/>
+            <w:tcBorders>
+              <w:top w:val="single" w:sz="4" w:space="0" w:color="000001"/>
+              <w:left w:val="single" w:sz="4" w:space="0" w:color="000001"/>
+              <w:bottom w:val="single" w:sz="4" w:space="0" w:color="000001"/>
+              <w:right w:val="single" w:sz="4" w:space="0" w:color="000001"/>
+            </w:tcBorders>
+            <w:shd w:val="clear" w:color="auto" w:fill="auto"/>
+          </w:tcPr>
+          <w:p>
+            <w:pPr>
+              <w:widowControl w:val="0"/>
+              <w:spacing w:before="1" w:after="0" w:line="240" w:lineRule="auto"/>
+              <w:ind w:left="102" w:right="-20"/>
+            </w:pPr>
+            <w:r>
+              <w:rPr>
+                <w:b/>
+              </w:rPr>
+              <w:t>Code Section</w:t>
+            </w:r>
+          </w:p>
+        </w:tc>
+        <w:tc>
+          <w:tcPr>
+            <w:tcW w:w="2970" w:type="dxa"/>
+            <w:tcBorders>
+              <w:top w:val="single" w:sz="4" w:space="0" w:color="000001"/>
+              <w:left w:val="single" w:sz="4" w:space="0" w:color="000001"/>
+              <w:bottom w:val="single" w:sz="4" w:space="0" w:color="000001"/>
+              <w:right w:val="single" w:sz="4" w:space="0" w:color="000001"/>
+            </w:tcBorders>
+            <w:shd w:val="clear" w:color="auto" w:fill="auto"/>
+          </w:tcPr>
+          <w:p>
+            <w:pPr>
+              <w:widowControl w:val="0"/>
+              <w:spacing w:after="0" w:line="240" w:lineRule="auto"/>
+              <w:ind w:left="102" w:right="-20"/>
+            </w:pPr>
+            <w:r>
+              <w:rPr>
+                <w:b/>
+              </w:rPr>
+              <w:t>Statute Description</w:t>
+            </w:r>
+          </w:p>
+        </w:tc>
+        <w:tc>
+          <w:tcPr>
+            <w:tcW w:w="900" w:type="dxa"/>
+            <w:tcBorders>
+              <w:top w:val="single" w:sz="4" w:space="0" w:color="000001"/>
+              <w:left w:val="single" w:sz="4" w:space="0" w:color="000001"/>
+              <w:bottom w:val="single" w:sz="4" w:space="0" w:color="000001"/>
+              <w:right w:val="single" w:sz="4" w:space="0" w:color="000001"/>
+            </w:tcBorders>
+            <w:shd w:val="clear" w:color="auto" w:fill="auto"/>
+          </w:tcPr>
+          <w:p>
+            <w:pPr>
+              <w:widowControl w:val="0"/>
+              <w:spacing w:after="0" w:line="240" w:lineRule="auto"/>
+              <w:ind w:left="100" w:right="-20"/>
+              <w:jc w:val="both"/>
+            </w:pPr>
+            <w:r>
+              <w:rPr>
+                <w:b/>
+              </w:rPr>
+              <w:t>Grade</w:t>
+            </w:r>
+          </w:p>
+        </w:tc>
+        <w:tc>
+          <w:tcPr>
+            <w:tcW w:w="1530" w:type="dxa"/>
+            <w:tcBorders>
+              <w:top w:val="single" w:sz="4" w:space="0" w:color="000001"/>
+              <w:left w:val="single" w:sz="4" w:space="0" w:color="000001"/>
+              <w:bottom w:val="single" w:sz="4" w:space="0" w:color="000001"/>
+              <w:right w:val="single" w:sz="4" w:space="0" w:color="000001"/>
+            </w:tcBorders>
+            <w:shd w:val="clear" w:color="auto" w:fill="auto"/>
+          </w:tcPr>
+          <w:p>
+            <w:pPr>
+              <w:widowControl w:val="0"/>
+              <w:spacing w:after="0" w:line="240" w:lineRule="auto"/>
+              <w:ind w:left="100" w:right="-20"/>
+              <w:jc w:val="both"/>
+              <w:rPr>
+                <w:b/>
+              </w:rPr>
+            </w:pPr>
+            <w:proofErr w:type="spellStart"/>
+            <w:r>
+              <w:rPr>
+                <w:b/>
+              </w:rPr>
+              <w:t>Disp</w:t>
+            </w:r>
+            <w:proofErr w:type="spellEnd"/>
+            <w:r>
+              <w:rPr>
+                <w:b/>
+              </w:rPr>
+              <w:t xml:space="preserve"> Date</w:t>
+            </w:r>
+          </w:p>
+        </w:tc>
+        <w:tc>
+          <w:tcPr>
+            <w:tcW w:w="3420" w:type="dxa"/>
+            <w:tcBorders>
+              <w:top w:val="single" w:sz="4" w:space="0" w:color="000001"/>
+              <w:left w:val="single" w:sz="4" w:space="0" w:color="000001"/>
+              <w:bottom w:val="single" w:sz="4" w:space="0" w:color="000001"/>
+              <w:right w:val="single" w:sz="4" w:space="0" w:color="000001"/>
+            </w:tcBorders>
+            <w:shd w:val="clear" w:color="auto" w:fill="auto"/>
+          </w:tcPr>
+          <w:p>
+            <w:pPr>
+              <w:widowControl w:val="0"/>
+              <w:spacing w:after="0" w:line="240" w:lineRule="auto"/>
+              <w:ind w:left="100" w:right="-20"/>
+            </w:pPr>
+            <w:r>
+              <w:rPr>
+                <w:b/>
+              </w:rPr>
+              <w:t>Disposition</w:t>
+            </w:r>
+          </w:p>
+        </w:tc>
+      </w:tr>
+      <w:tr>
+        <w:trPr>
+          <w:cantSplit/>
+          <w:trHeight w:val="259"/>
+        </w:trPr>
+        <w:tc>
+          <w:tcPr>
+            <w:tcW w:w="10696" w:type="dxa"/>
+            <w:gridSpan w:val="5"/>
+            <w:tcBorders>
+              <w:top w:val="single" w:sz="4" w:space="0" w:color="000001"/>
+              <w:left w:val="single" w:sz="4" w:space="0" w:color="000001"/>
+              <w:bottom w:val="single" w:sz="4" w:space="0" w:color="000001"/>
+              <w:right w:val="single" w:sz="4" w:space="0" w:color="000001"/>
+            </w:tcBorders>
+            <w:shd w:val="clear" w:color="auto" w:fill="auto"/>
+          </w:tcPr>
+          <w:p>
+            <w:pPr>
+              <w:widowControl w:val="0"/>
+              <w:spacing w:after="0" w:line="240" w:lineRule="auto"/>
+              <w:ind w:left="100" w:right="-20"/>
+            </w:pPr>
+            <w:r>
+              <w:t>{%tr for charge in charges %}</w:t>
+            </w:r>
+          </w:p>
+        </w:tc>
+      </w:tr>
+      <w:tr>
+        <w:trPr>
+          <w:cantSplit/>
+          <w:trHeight w:val="259"/>
+        </w:trPr>
+        <w:tc>
+          <w:tcPr>
+            <w:tcW w:w="1876" w:type="dxa"/>
+            <w:tcBorders>
+              <w:top w:val="single" w:sz="4" w:space="0" w:color="000001"/>
+              <w:left w:val="single" w:sz="4" w:space="0" w:color="000001"/>
+              <w:bottom w:val="single" w:sz="4" w:space="0" w:color="000001"/>
+              <w:right w:val="single" w:sz="4" w:space="0" w:color="000001"/>
+            </w:tcBorders>
+            <w:shd w:val="clear" w:color="auto" w:fill="auto"/>
+          </w:tcPr>
+          <w:p>
+            <w:pPr>
+              <w:widowControl w:val="0"/>
+              <w:spacing w:after="0" w:line="240" w:lineRule="auto"/>
+              <w:ind w:left="100" w:right="-20"/>
+            </w:pPr>
+            <w:r>
+              <w:t xml:space="preserve">{{ </w:t>
+            </w:r>
+            <w:proofErr w:type="spellStart"/>
+            <w:r>
+              <w:t>charge.statute</w:t>
+            </w:r>
+            <w:proofErr w:type="spellEnd"/>
+            <w:r>
+              <w:t xml:space="preserve"> }}</w:t>
+            </w:r>
+          </w:p>
+        </w:tc>
+        <w:tc>
+          <w:tcPr>
+            <w:tcW w:w="2970" w:type="dxa"/>
+            <w:tcBorders>
+              <w:top w:val="single" w:sz="4" w:space="0" w:color="000001"/>
+              <w:left w:val="single" w:sz="4" w:space="0" w:color="000001"/>
+              <w:bottom w:val="single" w:sz="4" w:space="0" w:color="000001"/>
+              <w:right w:val="single" w:sz="4" w:space="0" w:color="000001"/>
+            </w:tcBorders>
+            <w:shd w:val="clear" w:color="auto" w:fill="auto"/>
+          </w:tcPr>
+          <w:p>
+            <w:pPr>
+              <w:widowControl w:val="0"/>
+              <w:spacing w:after="0" w:line="240" w:lineRule="auto"/>
+              <w:ind w:left="100" w:right="-20"/>
+            </w:pPr>
+            <w:r>
+              <w:t xml:space="preserve">{{ </w:t>
+            </w:r>
+            <w:proofErr w:type="spellStart"/>
+            <w:r>
+              <w:t>charge.description</w:t>
+            </w:r>
+            <w:proofErr w:type="spellEnd"/>
+            <w:r>
+              <w:t xml:space="preserve"> }}</w:t>
+            </w:r>
+          </w:p>
+        </w:tc>
+        <w:tc>
+          <w:tcPr>
+            <w:tcW w:w="900" w:type="dxa"/>
+            <w:tcBorders>
+              <w:top w:val="single" w:sz="4" w:space="0" w:color="000001"/>
+              <w:left w:val="single" w:sz="4" w:space="0" w:color="000001"/>
+              <w:bottom w:val="single" w:sz="4" w:space="0" w:color="000001"/>
+              <w:right w:val="single" w:sz="4" w:space="0" w:color="000001"/>
+            </w:tcBorders>
+            <w:shd w:val="clear" w:color="auto" w:fill="auto"/>
+          </w:tcPr>
+          <w:p>
+            <w:pPr>
+              <w:widowControl w:val="0"/>
+              <w:spacing w:after="0" w:line="240" w:lineRule="auto"/>
+              <w:ind w:left="100" w:right="-20"/>
+            </w:pPr>
+            <w:r>
+              <w:t xml:space="preserve">{{ </w:t>
+            </w:r>
+            <w:proofErr w:type="spellStart"/>
+            <w:r>
+              <w:t>charge.grade</w:t>
+            </w:r>
+            <w:proofErr w:type="spellEnd"/>
+            <w:r>
+              <w:t xml:space="preserve"> }}</w:t>
+            </w:r>
+          </w:p>
+        </w:tc>
+        <w:tc>
+          <w:tcPr>
+            <w:tcW w:w="1530" w:type="dxa"/>
+            <w:tcBorders>
+              <w:top w:val="single" w:sz="4" w:space="0" w:color="000001"/>
+              <w:left w:val="single" w:sz="4" w:space="0" w:color="000001"/>
+              <w:bottom w:val="single" w:sz="4" w:space="0" w:color="000001"/>
+              <w:right w:val="single" w:sz="4" w:space="0" w:color="000001"/>
+            </w:tcBorders>
+            <w:shd w:val="clear" w:color="auto" w:fill="auto"/>
+          </w:tcPr>
+          <w:p>
+            <w:pPr>
+              <w:widowControl w:val="0"/>
+              <w:spacing w:after="0" w:line="240" w:lineRule="auto"/>
+              <w:ind w:left="100" w:right="-20"/>
+            </w:pPr>
+            <w:r>
+              <w:t xml:space="preserve">{{ </w:t>
+            </w:r>
+            <w:proofErr w:type="spellStart"/>
+            <w:r>
+              <w:t>charge.date|date</w:t>
+            </w:r>
+            <w:proofErr w:type="spellEnd"/>
+            <w:r>
+              <w:t xml:space="preserve"> }}</w:t>
+            </w:r>
+          </w:p>
+        </w:tc>
+        <w:tc>
+          <w:tcPr>
+            <w:tcW w:w="3420" w:type="dxa"/>
+            <w:tcBorders>
+              <w:top w:val="single" w:sz="4" w:space="0" w:color="000001"/>
+              <w:left w:val="single" w:sz="4" w:space="0" w:color="000001"/>
+              <w:bottom w:val="single" w:sz="4" w:space="0" w:color="000001"/>
+              <w:right w:val="single" w:sz="4" w:space="0" w:color="000001"/>
+            </w:tcBorders>
+            <w:shd w:val="clear" w:color="auto" w:fill="auto"/>
+          </w:tcPr>
+          <w:p>
+            <w:pPr>
+              <w:widowControl w:val="0"/>
+              <w:spacing w:after="0" w:line="240" w:lineRule="auto"/>
+              <w:ind w:left="100" w:right="-20"/>
+            </w:pPr>
+            <w:r>
+              <w:t xml:space="preserve">{{ </w:t>
+            </w:r>
+            <w:proofErr w:type="spellStart"/>
+            <w:r>
+              <w:t>charge.disposition</w:t>
+            </w:r>
+            <w:proofErr w:type="spellEnd"/>
+            <w:r>
+              <w:t xml:space="preserve"> }}</w:t>
+            </w:r>
+          </w:p>
+        </w:tc>
+      </w:tr>
+      <w:tr>
+        <w:trPr>
+          <w:cantSplit/>
+          <w:trHeight w:val="259"/>
+        </w:trPr>
+        <w:tc>
+          <w:tcPr>
+            <w:tcW w:w="10696" w:type="dxa"/>
+            <w:gridSpan w:val="5"/>
+            <w:tcBorders>
+              <w:top w:val="single" w:sz="4" w:space="0" w:color="000001"/>
+              <w:left w:val="single" w:sz="4" w:space="0" w:color="000001"/>
+              <w:bottom w:val="single" w:sz="4" w:space="0" w:color="000001"/>
+              <w:right w:val="single" w:sz="4" w:space="0" w:color="000001"/>
+            </w:tcBorders>
+            <w:shd w:val="clear" w:color="auto" w:fill="auto"/>
+          </w:tcPr>
+          <w:p>
+            <w:pPr>
+              <w:widowControl w:val="0"/>
+              <w:spacing w:after="0" w:line="240" w:lineRule="auto"/>
+              <w:ind w:left="100" w:right="-20"/>
+            </w:pPr>
+            <w:r>
+              <w:t xml:space="preserve">{%tr </w:t>
+            </w:r>
+            <w:proofErr w:type="spellStart"/>
+            <w:r>
+              <w:t>endfor</w:t>
+            </w:r>
+            <w:proofErr w:type="spellEnd"/>
+            <w:r>
+              <w:t xml:space="preserve"> %}</w:t>
+            </w:r>
+          </w:p>
+        </w:tc>
+      </w:tr>
+    </w:tbl>
+    <w:p>
+      <w:pPr>
+        <w:spacing w:after="0" w:line="240" w:lineRule="auto"/>
+        <w:jc w:val="both"/>
+        <w:rPr>
+          <w:b/>
+          <w:sz w:val="24"/>
+          <w:szCs w:val="24"/>
+        </w:rPr>
+      </w:pPr>
+    </w:p>
+    <w:p>
+      <w:pPr>
+        <w:spacing w:after="0" w:line="240" w:lineRule="auto"/>
+        <w:jc w:val="both"/>
+        <w:rPr>
+          <w:b/>
+          <w:sz w:val="24"/>
+          <w:szCs w:val="24"/>
+        </w:rPr>
+      </w:pPr>
+      <w:r>
+        <w:rPr>
+          <w:sz w:val="24"/>
+          <w:szCs w:val="24"/>
+        </w:rPr>
+        <w:lastRenderedPageBreak/>
+        <w:t xml:space="preserve">{%p if </w:t>
+      </w:r>
+      <w:proofErr w:type="spellStart"/>
+      <w:r>
+        <w:rPr>
+          <w:sz w:val="24"/>
+          <w:szCs w:val="24"/>
+        </w:rPr>
+        <w:t>fines.total</w:t>
+      </w:r>
+      <w:proofErr w:type="spellEnd"/>
+      <w:r>
+        <w:rPr>
+          <w:sz w:val="24"/>
+          <w:szCs w:val="24"/>
+        </w:rPr>
+        <w:t xml:space="preserve"> and </w:t>
+      </w:r>
+      <w:proofErr w:type="spellStart"/>
+      <w:r>
+        <w:rPr>
+          <w:sz w:val="24"/>
+          <w:szCs w:val="24"/>
+        </w:rPr>
+        <w:t>fines.paid</w:t>
+      </w:r>
+      <w:proofErr w:type="spellEnd"/>
+      <w:r>
+        <w:rPr>
+          <w:sz w:val="24"/>
+          <w:szCs w:val="24"/>
+        </w:rPr>
+        <w:t xml:space="preserve"> %}</w:t>
+      </w:r>
+    </w:p>
+    <w:p>
+      <w:pPr>
+        <w:numPr>
+          <w:ilvl w:val="0"/>
+          <w:numId w:val="2"/>
+        </w:numPr>
+        <w:pBdr>
+          <w:top w:val="nil"/>
+          <w:left w:val="nil"/>
+          <w:bottom w:val="nil"/>
+          <w:right w:val="nil"/>
+          <w:between w:val="nil"/>
+        </w:pBdr>
+        <w:spacing w:after="0" w:line="240" w:lineRule="auto"/>
+        <w:jc w:val="both"/>
+        <w:rPr>
           <w:rFonts w:eastAsia="Calibri" w:cs="Calibri"/>
           <w:b/>
           <w:sz w:val="24"/>
@@ -1772,7 +2414,35 @@
         <w:rPr>
           <w:rFonts w:eastAsia="Calibri" w:cs="Calibri"/>
         </w:rPr>
-        <w:t>The Petitioner’s sentence includes fines, costs and/or restitution in the amount of ${{ fines.total }} and ${{ fines.paid }}  has been paid off/adjusted.</w:t>
+        <w:t xml:space="preserve">The Petitioner’s sentence includes fines, costs and/or restitution in the amount of ${{ </w:t>
+      </w:r>
+      <w:proofErr w:type="spellStart"/>
+      <w:r>
+        <w:rPr>
+          <w:rFonts w:eastAsia="Calibri" w:cs="Calibri"/>
+        </w:rPr>
+        <w:t>fines.total</w:t>
+      </w:r>
+      <w:proofErr w:type="spellEnd"/>
+      <w:r>
+        <w:rPr>
+          <w:rFonts w:eastAsia="Calibri" w:cs="Calibri"/>
+        </w:rPr>
+        <w:t xml:space="preserve"> }} and ${{ </w:t>
+      </w:r>
+      <w:proofErr w:type="spellStart"/>
+      <w:r>
+        <w:rPr>
+          <w:rFonts w:eastAsia="Calibri" w:cs="Calibri"/>
+        </w:rPr>
+        <w:t>fines.paid</w:t>
+      </w:r>
+      <w:proofErr w:type="spellEnd"/>
+      <w:r>
+        <w:rPr>
+          <w:rFonts w:eastAsia="Calibri" w:cs="Calibri"/>
+        </w:rPr>
+        <w:t xml:space="preserve"> }}  has been paid off/adjusted.</w:t>
       </w:r>
     </w:p>
     <w:p>
@@ -1826,7 +2496,39 @@
           <w:sz w:val="24"/>
           <w:szCs w:val="24"/>
         </w:rPr>
-        <w:t xml:space="preserve">{% if fines.total and fines.paid %} </w:t>
+        <w:t xml:space="preserve">{% if </w:t>
+      </w:r>
+      <w:proofErr w:type="spellStart"/>
+      <w:r>
+        <w:rPr>
+          <w:sz w:val="24"/>
+          <w:szCs w:val="24"/>
+        </w:rPr>
+        <w:t>fines.total</w:t>
+      </w:r>
+      <w:proofErr w:type="spellEnd"/>
+      <w:r>
+        <w:rPr>
+          <w:sz w:val="24"/>
+          <w:szCs w:val="24"/>
+        </w:rPr>
+        <w:t xml:space="preserve"> and </w:t>
+      </w:r>
+      <w:proofErr w:type="spellStart"/>
+      <w:r>
+        <w:rPr>
+          <w:sz w:val="24"/>
+          <w:szCs w:val="24"/>
+        </w:rPr>
+        <w:t>fines.paid</w:t>
+      </w:r>
+      <w:proofErr w:type="spellEnd"/>
+      <w:r>
+        <w:rPr>
+          <w:sz w:val="24"/>
+          <w:szCs w:val="24"/>
+        </w:rPr>
+        <w:t xml:space="preserve"> %} </w:t>
       </w:r>
       <w:r>
         <w:rPr>
@@ -1834,7 +2536,23 @@
           <w:sz w:val="24"/>
           <w:szCs w:val="24"/>
         </w:rPr>
-        <w:t xml:space="preserve">11. </w:t>
+        <w:t>1</w:t>
+      </w:r>
+      <w:r>
+        <w:rPr>
+          <w:b/>
+          <w:sz w:val="24"/>
+          <w:szCs w:val="24"/>
+        </w:rPr>
+        <w:t>3</w:t>
+      </w:r>
+      <w:r>
+        <w:rPr>
+          <w:b/>
+          <w:sz w:val="24"/>
+          <w:szCs w:val="24"/>
+        </w:rPr>
+        <w:t xml:space="preserve">. </w:t>
       </w:r>
       <w:r>
         <w:rPr>
@@ -1849,7 +2567,23 @@
           <w:sz w:val="24"/>
           <w:szCs w:val="24"/>
         </w:rPr>
-        <w:t xml:space="preserve"> 10. </w:t>
+        <w:t xml:space="preserve"> 1</w:t>
+      </w:r>
+      <w:r>
+        <w:rPr>
+          <w:b/>
+          <w:sz w:val="24"/>
+          <w:szCs w:val="24"/>
+        </w:rPr>
+        <w:t>2</w:t>
+      </w:r>
+      <w:r>
+        <w:rPr>
+          <w:b/>
+          <w:sz w:val="24"/>
+          <w:szCs w:val="24"/>
+        </w:rPr>
+        <w:t xml:space="preserve">. </w:t>
       </w:r>
       <w:r>
         <w:rPr>
@@ -1874,8 +2608,15 @@
         <w:ind w:left="360"/>
       </w:pPr>
       <w:r>
-        <w:lastRenderedPageBreak/>
-        <w:t xml:space="preserve">As a result of these arrests and subsequent photographing and fingerprinting, Petitioner has been caused to suffer embarrassment and irreparable harm and loss of job opportunities.  Expungement is proper under 18 Pa.C.S. 9122 as the charges to be expunged were </w:t>
+        <w:t xml:space="preserve">As a result of these arrests and subsequent photographing and fingerprinting, Petitioner has been caused to suffer embarrassment and irreparable harm and loss of job opportunities.  Expungement is proper under 18 </w:t>
+      </w:r>
+      <w:proofErr w:type="spellStart"/>
+      <w:r>
+        <w:t>Pa.C.S</w:t>
+      </w:r>
+      <w:proofErr w:type="spellEnd"/>
+      <w:r>
+        <w:t xml:space="preserve">. 9122 as the charges to be expunged were </w:t>
       </w:r>
       <w:r>
         <w:rPr>
@@ -1908,7 +2649,39 @@
           <w:sz w:val="24"/>
           <w:szCs w:val="24"/>
         </w:rPr>
-        <w:t xml:space="preserve">{% if fines.total and fines.paid %} </w:t>
+        <w:t xml:space="preserve">{% if </w:t>
+      </w:r>
+      <w:proofErr w:type="spellStart"/>
+      <w:r>
+        <w:rPr>
+          <w:sz w:val="24"/>
+          <w:szCs w:val="24"/>
+        </w:rPr>
+        <w:t>fines.total</w:t>
+      </w:r>
+      <w:proofErr w:type="spellEnd"/>
+      <w:r>
+        <w:rPr>
+          <w:sz w:val="24"/>
+          <w:szCs w:val="24"/>
+        </w:rPr>
+        <w:t xml:space="preserve"> and </w:t>
+      </w:r>
+      <w:proofErr w:type="spellStart"/>
+      <w:r>
+        <w:rPr>
+          <w:sz w:val="24"/>
+          <w:szCs w:val="24"/>
+        </w:rPr>
+        <w:t>fines.paid</w:t>
+      </w:r>
+      <w:proofErr w:type="spellEnd"/>
+      <w:r>
+        <w:rPr>
+          <w:sz w:val="24"/>
+          <w:szCs w:val="24"/>
+        </w:rPr>
+        <w:t xml:space="preserve"> %} </w:t>
       </w:r>
       <w:r>
         <w:rPr>
@@ -1916,7 +2689,23 @@
           <w:sz w:val="24"/>
           <w:szCs w:val="24"/>
         </w:rPr>
-        <w:t xml:space="preserve">12. </w:t>
+        <w:t>1</w:t>
+      </w:r>
+      <w:r>
+        <w:rPr>
+          <w:b/>
+          <w:sz w:val="24"/>
+          <w:szCs w:val="24"/>
+        </w:rPr>
+        <w:t>4</w:t>
+      </w:r>
+      <w:r>
+        <w:rPr>
+          <w:b/>
+          <w:sz w:val="24"/>
+          <w:szCs w:val="24"/>
+        </w:rPr>
+        <w:t xml:space="preserve">. </w:t>
       </w:r>
       <w:r>
         <w:rPr>
@@ -1931,7 +2720,23 @@
           <w:sz w:val="24"/>
           <w:szCs w:val="24"/>
         </w:rPr>
-        <w:t xml:space="preserve"> 11. </w:t>
+        <w:t xml:space="preserve"> 1</w:t>
+      </w:r>
+      <w:r>
+        <w:rPr>
+          <w:b/>
+          <w:sz w:val="24"/>
+          <w:szCs w:val="24"/>
+        </w:rPr>
+        <w:t>2</w:t>
+      </w:r>
+      <w:r>
+        <w:rPr>
+          <w:b/>
+          <w:sz w:val="24"/>
+          <w:szCs w:val="24"/>
+        </w:rPr>
+        <w:t xml:space="preserve">. </w:t>
       </w:r>
       <w:r>
         <w:rPr>
@@ -2212,22 +3017,62 @@
       </w:r>
       <w:r>
         <w:br/>
-        <w:t>BY: {{ attorney.user.first_name }} {{ attorney.user.last_name }}</w:t>
+        <w:t xml:space="preserve">BY: {{ </w:t>
+      </w:r>
+      <w:proofErr w:type="spellStart"/>
+      <w:r>
+        <w:t>attorney.user.first_name</w:t>
+      </w:r>
+      <w:proofErr w:type="spellEnd"/>
+      <w:r>
+        <w:t xml:space="preserve"> }} {{ </w:t>
+      </w:r>
+      <w:proofErr w:type="spellStart"/>
+      <w:r>
+        <w:t>attorney.user.last_name</w:t>
+      </w:r>
+      <w:proofErr w:type="spellEnd"/>
+      <w:r>
+        <w:t xml:space="preserve"> }}</w:t>
       </w:r>
       <w:r>
         <w:br/>
-        <w:t>Identification No.: {{ attorney.bar }}</w:t>
+        <w:t xml:space="preserve">Identification No.: {{ </w:t>
+      </w:r>
+      <w:proofErr w:type="spellStart"/>
+      <w:r>
+        <w:t>attorney.bar</w:t>
+      </w:r>
+      <w:proofErr w:type="spellEnd"/>
+      <w:r>
+        <w:t xml:space="preserve"> }}</w:t>
       </w:r>
       <w:r>
         <w:br/>
       </w:r>
       <w:r>
         <w:br/>
-        <w:t>{{r organization.formattedAddress }}</w:t>
+        <w:t xml:space="preserve">{{r </w:t>
+      </w:r>
+      <w:proofErr w:type="spellStart"/>
+      <w:r>
+        <w:t>organization.formattedAddress</w:t>
+      </w:r>
+      <w:proofErr w:type="spellEnd"/>
+      <w:r>
+        <w:t xml:space="preserve"> }}</w:t>
       </w:r>
       <w:r>
         <w:br/>
-        <w:t>{{ organization.phone }}</w:t>
+        <w:t xml:space="preserve">{{ </w:t>
+      </w:r>
+      <w:proofErr w:type="spellStart"/>
+      <w:r>
+        <w:t>organization.phone</w:t>
+      </w:r>
+      <w:proofErr w:type="spellEnd"/>
+      <w:r>
+        <w:t xml:space="preserve"> }}</w:t>
       </w:r>
       <w:r>
         <w:br/>
@@ -2344,7 +3189,15 @@
               <w:jc w:val="center"/>
             </w:pPr>
             <w:r>
-              <w:t xml:space="preserve">{{r petitioner.formattedAddress}}                                                                                    </w:t>
+              <w:t xml:space="preserve">{{r </w:t>
+            </w:r>
+            <w:proofErr w:type="spellStart"/>
+            <w:r>
+              <w:t>petitioner.formattedAddress</w:t>
+            </w:r>
+            <w:proofErr w:type="spellEnd"/>
+            <w:r>
+              <w:t xml:space="preserve">}}                                                                                    </w:t>
             </w:r>
           </w:p>
         </w:tc>
@@ -2609,7 +3462,15 @@
               <w:spacing w:after="0" w:line="240" w:lineRule="auto"/>
             </w:pPr>
             <w:r>
-              <w:t>{% endfor -%}</w:t>
+              <w:t xml:space="preserve">{% </w:t>
+            </w:r>
+            <w:proofErr w:type="spellStart"/>
+            <w:r>
+              <w:t>endfor</w:t>
+            </w:r>
+            <w:proofErr w:type="spellEnd"/>
+            <w:r>
+              <w:t xml:space="preserve"> -%}</w:t>
             </w:r>
           </w:p>
           <w:p>
@@ -2623,7 +3484,15 @@
               <w:spacing w:after="0" w:line="240" w:lineRule="auto"/>
             </w:pPr>
             <w:r>
-              <w:t>OTN# {{ petition.otn }}</w:t>
+              <w:t xml:space="preserve">OTN# {{ </w:t>
+            </w:r>
+            <w:proofErr w:type="spellStart"/>
+            <w:r>
+              <w:t>petition.otn</w:t>
+            </w:r>
+            <w:proofErr w:type="spellEnd"/>
+            <w:r>
+              <w:t xml:space="preserve"> }}</w:t>
             </w:r>
           </w:p>
           <w:p>
@@ -2636,7 +3505,15 @@
               <w:spacing w:after="0" w:line="240" w:lineRule="auto"/>
             </w:pPr>
             <w:r>
-              <w:t>DOB: {{ petitioner.dob|date }}</w:t>
+              <w:t xml:space="preserve">DOB: {{ </w:t>
+            </w:r>
+            <w:proofErr w:type="spellStart"/>
+            <w:r>
+              <w:t>petitioner.dob|date</w:t>
+            </w:r>
+            <w:proofErr w:type="spellEnd"/>
+            <w:r>
+              <w:t xml:space="preserve"> }}</w:t>
             </w:r>
           </w:p>
           <w:p>
@@ -2649,7 +3526,15 @@
               <w:spacing w:after="0" w:line="240" w:lineRule="auto"/>
             </w:pPr>
             <w:r>
-              <w:t>SSN: {{ petitioner.ssn }}</w:t>
+              <w:t xml:space="preserve">SSN: {{ </w:t>
+            </w:r>
+            <w:proofErr w:type="spellStart"/>
+            <w:r>
+              <w:t>petitioner.ssn</w:t>
+            </w:r>
+            <w:proofErr w:type="spellEnd"/>
+            <w:r>
+              <w:t xml:space="preserve"> }}</w:t>
             </w:r>
           </w:p>
         </w:tc>
@@ -2698,7 +3583,43 @@
           <w:sz w:val="24"/>
           <w:szCs w:val="24"/>
         </w:rPr>
-        <w:t>Petition for {{ petition.ratio.value }} Pursuant to Pa.R.Crim.P. 790</w:t>
+        <w:t xml:space="preserve">Petition for {{ </w:t>
+      </w:r>
+      <w:proofErr w:type="spellStart"/>
+      <w:r>
+        <w:rPr>
+          <w:b/>
+          <w:sz w:val="24"/>
+          <w:szCs w:val="24"/>
+        </w:rPr>
+        <w:t>petition.ratio.value</w:t>
+      </w:r>
+      <w:proofErr w:type="spellEnd"/>
+      <w:r>
+        <w:rPr>
+          <w:b/>
+          <w:sz w:val="24"/>
+          <w:szCs w:val="24"/>
+        </w:rPr>
+        <w:t xml:space="preserve"> }} Pursuant to </w:t>
+      </w:r>
+      <w:proofErr w:type="spellStart"/>
+      <w:r>
+        <w:rPr>
+          <w:b/>
+          <w:sz w:val="24"/>
+          <w:szCs w:val="24"/>
+        </w:rPr>
+        <w:t>Pa.R.Crim.P</w:t>
+      </w:r>
+      <w:proofErr w:type="spellEnd"/>
+      <w:r>
+        <w:rPr>
+          <w:b/>
+          <w:sz w:val="24"/>
+          <w:szCs w:val="24"/>
+        </w:rPr>
+        <w:t>. 790</w:t>
       </w:r>
     </w:p>
     <w:p>
@@ -2718,7 +3639,71 @@
           <w:sz w:val="24"/>
           <w:szCs w:val="24"/>
         </w:rPr>
-        <w:t>AND NOW, the Petitioner, through counsel {{ attorney.user.first_name }} {{ attorney.user.last_name }}, Esquire, avers the following and requests that this petition for {{ petition.ratio.value }} pursuant to Pa.R.Crim.P. 790 be granted for the reasons set forth below.</w:t>
+        <w:t xml:space="preserve">AND NOW, the Petitioner, through counsel {{ </w:t>
+      </w:r>
+      <w:proofErr w:type="spellStart"/>
+      <w:r>
+        <w:rPr>
+          <w:sz w:val="24"/>
+          <w:szCs w:val="24"/>
+        </w:rPr>
+        <w:t>attorney.user.first_name</w:t>
+      </w:r>
+      <w:proofErr w:type="spellEnd"/>
+      <w:r>
+        <w:rPr>
+          <w:sz w:val="24"/>
+          <w:szCs w:val="24"/>
+        </w:rPr>
+        <w:t xml:space="preserve"> }} {{ </w:t>
+      </w:r>
+      <w:proofErr w:type="spellStart"/>
+      <w:r>
+        <w:rPr>
+          <w:sz w:val="24"/>
+          <w:szCs w:val="24"/>
+        </w:rPr>
+        <w:t>attorney.user.last_name</w:t>
+      </w:r>
+      <w:proofErr w:type="spellEnd"/>
+      <w:r>
+        <w:rPr>
+          <w:sz w:val="24"/>
+          <w:szCs w:val="24"/>
+        </w:rPr>
+        <w:t xml:space="preserve"> }}, Esquire, avers the following and requests that this petition for {{ </w:t>
+      </w:r>
+      <w:proofErr w:type="spellStart"/>
+      <w:r>
+        <w:rPr>
+          <w:sz w:val="24"/>
+          <w:szCs w:val="24"/>
+        </w:rPr>
+        <w:t>petition.ratio.value</w:t>
+      </w:r>
+      <w:proofErr w:type="spellEnd"/>
+      <w:r>
+        <w:rPr>
+          <w:sz w:val="24"/>
+          <w:szCs w:val="24"/>
+        </w:rPr>
+        <w:t xml:space="preserve"> }} pursuant to </w:t>
+      </w:r>
+      <w:proofErr w:type="spellStart"/>
+      <w:r>
+        <w:rPr>
+          <w:sz w:val="24"/>
+          <w:szCs w:val="24"/>
+        </w:rPr>
+        <w:t>Pa.R.Crim.P</w:t>
+      </w:r>
+      <w:proofErr w:type="spellEnd"/>
+      <w:r>
+        <w:rPr>
+          <w:sz w:val="24"/>
+          <w:szCs w:val="24"/>
+        </w:rPr>
+        <w:t>. 790 be granted for the reasons set forth below.</w:t>
       </w:r>
     </w:p>
     <w:p>
@@ -2739,14 +3724,15 @@
         <w:tblLook w:val="0000" w:firstRow="0" w:lastRow="0" w:firstColumn="0" w:lastColumn="0" w:noHBand="0" w:noVBand="0"/>
       </w:tblPr>
       <w:tblGrid>
-        <w:gridCol w:w="2136"/>
-        <w:gridCol w:w="2271"/>
-        <w:gridCol w:w="520"/>
-        <w:gridCol w:w="292"/>
+        <w:gridCol w:w="1966"/>
+        <w:gridCol w:w="2441"/>
+        <w:gridCol w:w="349"/>
+        <w:gridCol w:w="463"/>
         <w:gridCol w:w="428"/>
         <w:gridCol w:w="766"/>
         <w:gridCol w:w="941"/>
-        <w:gridCol w:w="3425"/>
+        <w:gridCol w:w="645"/>
+        <w:gridCol w:w="2780"/>
       </w:tblGrid>
       <w:tr>
         <w:trPr>
@@ -2755,7 +3741,7 @@
         <w:tc>
           <w:tcPr>
             <w:tcW w:w="10779" w:type="dxa"/>
-            <w:gridSpan w:val="8"/>
+            <w:gridSpan w:val="9"/>
             <w:tcBorders>
               <w:top w:val="single" w:sz="4" w:space="0" w:color="000001"/>
               <w:left w:val="single" w:sz="4" w:space="0" w:color="000001"/>
@@ -2857,14 +3843,22 @@
               <w:t>DOB:</w:t>
             </w:r>
             <w:r>
-              <w:t xml:space="preserve"> {{ petitioner.dob|date }}</w:t>
+              <w:t xml:space="preserve"> {{ </w:t>
+            </w:r>
+            <w:proofErr w:type="spellStart"/>
+            <w:r>
+              <w:t>petitioner.dob|date</w:t>
+            </w:r>
+            <w:proofErr w:type="spellEnd"/>
+            <w:r>
+              <w:t xml:space="preserve"> }}</w:t>
             </w:r>
           </w:p>
         </w:tc>
         <w:tc>
           <w:tcPr>
             <w:tcW w:w="4366" w:type="dxa"/>
-            <w:gridSpan w:val="2"/>
+            <w:gridSpan w:val="3"/>
             <w:tcBorders>
               <w:top w:val="single" w:sz="4" w:space="0" w:color="000001"/>
               <w:left w:val="single" w:sz="4" w:space="0" w:color="000001"/>
@@ -2886,7 +3880,15 @@
               <w:t>Social Security Number:</w:t>
             </w:r>
             <w:r>
-              <w:t xml:space="preserve"> {{ petitioner.ssn }}</w:t>
+              <w:t xml:space="preserve"> {{ </w:t>
+            </w:r>
+            <w:proofErr w:type="spellStart"/>
+            <w:r>
+              <w:t>petitioner.ssn</w:t>
+            </w:r>
+            <w:proofErr w:type="spellEnd"/>
+            <w:r>
+              <w:t xml:space="preserve"> }}</w:t>
             </w:r>
           </w:p>
         </w:tc>
@@ -2927,14 +3929,22 @@
               <w:ind w:left="102" w:right="-20"/>
             </w:pPr>
             <w:r>
-              <w:t>{{r petitioner.formattedAddress}}</w:t>
+              <w:t xml:space="preserve">{{r </w:t>
+            </w:r>
+            <w:proofErr w:type="spellStart"/>
+            <w:r>
+              <w:t>petitioner.formattedAddress</w:t>
+            </w:r>
+            <w:proofErr w:type="spellEnd"/>
+            <w:r>
+              <w:t>}}</w:t>
             </w:r>
           </w:p>
         </w:tc>
         <w:tc>
           <w:tcPr>
             <w:tcW w:w="6372" w:type="dxa"/>
-            <w:gridSpan w:val="6"/>
+            <w:gridSpan w:val="7"/>
             <w:tcBorders>
               <w:top w:val="single" w:sz="4" w:space="0" w:color="000001"/>
               <w:left w:val="single" w:sz="4" w:space="0" w:color="000001"/>
@@ -2956,7 +3966,15 @@
               <w:t>Alias(es):</w:t>
             </w:r>
             <w:r>
-              <w:t xml:space="preserve"> {{ petitioner.aliases|comma_join }}</w:t>
+              <w:t xml:space="preserve"> {{ </w:t>
+            </w:r>
+            <w:proofErr w:type="spellStart"/>
+            <w:r>
+              <w:t>petitioner.aliases|comma_join</w:t>
+            </w:r>
+            <w:proofErr w:type="spellEnd"/>
+            <w:r>
+              <w:t xml:space="preserve"> }}</w:t>
             </w:r>
           </w:p>
         </w:tc>
@@ -2968,7 +3986,7 @@
         <w:tc>
           <w:tcPr>
             <w:tcW w:w="10779" w:type="dxa"/>
-            <w:gridSpan w:val="8"/>
+            <w:gridSpan w:val="9"/>
             <w:tcBorders>
               <w:top w:val="single" w:sz="4" w:space="0" w:color="000001"/>
               <w:left w:val="single" w:sz="4" w:space="0" w:color="000001"/>
@@ -3022,7 +4040,15 @@
               <w:t>Judge</w:t>
             </w:r>
             <w:r>
-              <w:t>: {{ petition.judge }}</w:t>
+              <w:t xml:space="preserve">: {{ </w:t>
+            </w:r>
+            <w:proofErr w:type="spellStart"/>
+            <w:r>
+              <w:t>petition.judge</w:t>
+            </w:r>
+            <w:proofErr w:type="spellEnd"/>
+            <w:r>
+              <w:t xml:space="preserve"> }}</w:t>
             </w:r>
           </w:p>
           <w:p>
@@ -3036,7 +4062,7 @@
         <w:tc>
           <w:tcPr>
             <w:tcW w:w="5560" w:type="dxa"/>
-            <w:gridSpan w:val="4"/>
+            <w:gridSpan w:val="5"/>
             <w:tcBorders>
               <w:top w:val="single" w:sz="8" w:space="0" w:color="000001"/>
               <w:left w:val="single" w:sz="4" w:space="0" w:color="000001"/>
@@ -3055,17 +4081,18 @@
               <w:rPr>
                 <w:b/>
               </w:rPr>
-              <w:t>Date on Complaint:</w:t>
-            </w:r>
-          </w:p>
-          <w:p>
-            <w:pPr>
-              <w:widowControl w:val="0"/>
-              <w:spacing w:after="0" w:line="204" w:lineRule="auto"/>
-              <w:ind w:left="102" w:right="-20"/>
-            </w:pPr>
-            <w:r>
-              <w:t>{{ petition.complaint_date|date }}</w:t>
+              <w:t>Address:</w:t>
+            </w:r>
+            <w:r>
+              <w:t xml:space="preserve"> Criminal Justice Center</w:t>
+            </w:r>
+            <w:r>
+              <w:br/>
+              <w:t>1301 Filbert Street</w:t>
+            </w:r>
+            <w:r>
+              <w:br/>
+              <w:t>Philadelphia, PA 19107</w:t>
             </w:r>
           </w:p>
         </w:tc>
@@ -3195,7 +4222,15 @@
                     <w:ind w:right="-20"/>
                   </w:pPr>
                   <w:r>
-                    <w:t>{%tr endfor %}</w:t>
+                    <w:t xml:space="preserve">{%tr </w:t>
+                  </w:r>
+                  <w:proofErr w:type="spellStart"/>
+                  <w:r>
+                    <w:t>endfor</w:t>
+                  </w:r>
+                  <w:proofErr w:type="spellEnd"/>
+                  <w:r>
+                    <w:t xml:space="preserve"> %}</w:t>
                   </w:r>
                 </w:p>
               </w:tc>
@@ -3212,7 +4247,7 @@
         <w:tc>
           <w:tcPr>
             <w:tcW w:w="5560" w:type="dxa"/>
-            <w:gridSpan w:val="4"/>
+            <w:gridSpan w:val="5"/>
             <w:tcBorders>
               <w:left w:val="single" w:sz="4" w:space="0" w:color="000001"/>
               <w:bottom w:val="single" w:sz="8" w:space="0" w:color="000001"/>
@@ -3230,18 +4265,18 @@
               <w:rPr>
                 <w:b/>
               </w:rPr>
-              <w:t>Address:</w:t>
-            </w:r>
-            <w:r>
-              <w:t xml:space="preserve"> Criminal Justice Center</w:t>
-            </w:r>
-            <w:r>
-              <w:br/>
-              <w:t>1301 Filbert Street</w:t>
-            </w:r>
-            <w:r>
-              <w:br/>
-              <w:t>Philadelphia, PA 19107</w:t>
+              <w:t>Offense Tracking Number (OTN):</w:t>
+            </w:r>
+            <w:r>
+              <w:t xml:space="preserve">  {{ </w:t>
+            </w:r>
+            <w:proofErr w:type="spellStart"/>
+            <w:r>
+              <w:t>petition.otn</w:t>
+            </w:r>
+            <w:proofErr w:type="spellEnd"/>
+            <w:r>
+              <w:t xml:space="preserve"> }}</w:t>
             </w:r>
           </w:p>
         </w:tc>
@@ -3279,13 +4314,13 @@
               <w:ind w:left="102" w:right="-20"/>
             </w:pPr>
             <w:r>
-              <w:t xml:space="preserve"> {{ petition.arrest_agency }}</w:t>
+              <w:t>Philadelphia Police Dept</w:t>
             </w:r>
           </w:p>
         </w:tc>
         <w:tc>
           <w:tcPr>
-            <w:tcW w:w="5560" w:type="dxa"/>
+            <w:tcW w:w="2780" w:type="dxa"/>
             <w:gridSpan w:val="4"/>
             <w:tcBorders>
               <w:top w:val="single" w:sz="8" w:space="0" w:color="000001"/>
@@ -3304,11 +4339,77 @@
             <w:r>
               <w:rPr>
                 <w:b/>
-              </w:rPr>
-              <w:t>Offense Tracking Number (OTN):</w:t>
-            </w:r>
-            <w:r>
-              <w:t xml:space="preserve">  {{ petition.otn }}</w:t>
+                <w:bCs/>
+              </w:rPr>
+              <w:t>Date of Arrest:</w:t>
+            </w:r>
+          </w:p>
+          <w:p>
+            <w:pPr>
+              <w:widowControl w:val="0"/>
+              <w:spacing w:after="0" w:line="205" w:lineRule="auto"/>
+              <w:ind w:left="85" w:right="-20"/>
+            </w:pPr>
+            <w:r>
+              <w:t xml:space="preserve">{{ </w:t>
+            </w:r>
+            <w:proofErr w:type="spellStart"/>
+            <w:r>
+              <w:t>petition.arrest_date</w:t>
+            </w:r>
+            <w:r>
+              <w:t>|date</w:t>
+            </w:r>
+            <w:proofErr w:type="spellEnd"/>
+            <w:r>
+              <w:t xml:space="preserve"> }}</w:t>
+            </w:r>
+          </w:p>
+        </w:tc>
+        <w:tc>
+          <w:tcPr>
+            <w:tcW w:w="2780" w:type="dxa"/>
+            <w:tcBorders>
+              <w:top w:val="single" w:sz="8" w:space="0" w:color="000001"/>
+              <w:left w:val="single" w:sz="4" w:space="0" w:color="000001"/>
+              <w:bottom w:val="single" w:sz="4" w:space="0" w:color="000001"/>
+              <w:right w:val="single" w:sz="4" w:space="0" w:color="000001"/>
+            </w:tcBorders>
+            <w:shd w:val="clear" w:color="auto" w:fill="auto"/>
+          </w:tcPr>
+          <w:p>
+            <w:pPr>
+              <w:widowControl w:val="0"/>
+              <w:spacing w:after="0" w:line="205" w:lineRule="auto"/>
+              <w:ind w:left="85" w:right="-20"/>
+            </w:pPr>
+            <w:r>
+              <w:rPr>
+                <w:b/>
+                <w:bCs/>
+              </w:rPr>
+              <w:t>Date on Complaint:</w:t>
+            </w:r>
+          </w:p>
+          <w:p>
+            <w:pPr>
+              <w:widowControl w:val="0"/>
+              <w:spacing w:after="0" w:line="205" w:lineRule="auto"/>
+              <w:ind w:left="85" w:right="-20"/>
+            </w:pPr>
+            <w:r>
+              <w:t xml:space="preserve">{{ </w:t>
+            </w:r>
+            <w:proofErr w:type="spellStart"/>
+            <w:r>
+              <w:t>petition.complaint_date</w:t>
+            </w:r>
+            <w:r>
+              <w:t>|date</w:t>
+            </w:r>
+            <w:proofErr w:type="spellEnd"/>
+            <w:r>
+              <w:t xml:space="preserve"> }}</w:t>
             </w:r>
           </w:p>
         </w:tc>
@@ -3349,14 +4450,14 @@
               <w:ind w:left="102" w:right="-20"/>
             </w:pPr>
             <w:r>
-              <w:t>{{ petition.arrest_officer }}</w:t>
+              <w:t>Philadelphia Police Dept</w:t>
             </w:r>
           </w:p>
         </w:tc>
         <w:tc>
           <w:tcPr>
             <w:tcW w:w="5560" w:type="dxa"/>
-            <w:gridSpan w:val="4"/>
+            <w:gridSpan w:val="5"/>
             <w:tcBorders>
               <w:top w:val="single" w:sz="8" w:space="0" w:color="000001"/>
               <w:left w:val="single" w:sz="4" w:space="0" w:color="000001"/>
@@ -3370,9 +4471,13 @@
               <w:widowControl w:val="0"/>
               <w:spacing w:after="0" w:line="205" w:lineRule="auto"/>
               <w:ind w:left="102" w:right="-20"/>
-            </w:pPr>
-            <w:r>
-              <w:rPr>
+              <w:rPr>
+                <w:rFonts w:asciiTheme="minorHAnsi" w:hAnsiTheme="minorHAnsi" w:cstheme="minorHAnsi"/>
+              </w:rPr>
+            </w:pPr>
+            <w:r>
+              <w:rPr>
+                <w:rFonts w:asciiTheme="minorHAnsi" w:hAnsiTheme="minorHAnsi" w:cstheme="minorHAnsi"/>
                 <w:b/>
               </w:rPr>
               <w:t>Address:</w:t>
@@ -3385,7 +4490,10 @@
               <w:ind w:left="102" w:right="-20"/>
             </w:pPr>
             <w:r>
-              <w:t>Philadelphia County, PA</w:t>
+              <w:rPr>
+                <w:rFonts w:asciiTheme="minorHAnsi" w:hAnsiTheme="minorHAnsi" w:cstheme="minorHAnsi"/>
+              </w:rPr>
+              <w:t>Philadelphia Police Dept, Philadelphia County, PA</w:t>
             </w:r>
           </w:p>
         </w:tc>
@@ -3394,7 +4502,7 @@
         <w:tc>
           <w:tcPr>
             <w:tcW w:w="10779" w:type="dxa"/>
-            <w:gridSpan w:val="8"/>
+            <w:gridSpan w:val="9"/>
             <w:tcBorders>
               <w:top w:val="single" w:sz="4" w:space="0" w:color="000001"/>
               <w:left w:val="single" w:sz="4" w:space="0" w:color="000001"/>
@@ -3422,7 +4530,7 @@
       <w:tr>
         <w:tc>
           <w:tcPr>
-            <w:tcW w:w="2136" w:type="dxa"/>
+            <w:tcW w:w="1966" w:type="dxa"/>
             <w:tcBorders>
               <w:top w:val="single" w:sz="4" w:space="0" w:color="000001"/>
               <w:left w:val="single" w:sz="4" w:space="0" w:color="000001"/>
@@ -3447,7 +4555,7 @@
         </w:tc>
         <w:tc>
           <w:tcPr>
-            <w:tcW w:w="2791" w:type="dxa"/>
+            <w:tcW w:w="2790" w:type="dxa"/>
             <w:gridSpan w:val="2"/>
             <w:tcBorders>
               <w:top w:val="single" w:sz="4" w:space="0" w:color="000001"/>
@@ -3473,7 +4581,7 @@
         </w:tc>
         <w:tc>
           <w:tcPr>
-            <w:tcW w:w="720" w:type="dxa"/>
+            <w:tcW w:w="891" w:type="dxa"/>
             <w:gridSpan w:val="2"/>
             <w:tcBorders>
               <w:top w:val="single" w:sz="4" w:space="0" w:color="000001"/>
@@ -3520,17 +4628,26 @@
                 <w:b/>
               </w:rPr>
             </w:pPr>
+            <w:proofErr w:type="spellStart"/>
             <w:r>
               <w:rPr>
                 <w:b/>
               </w:rPr>
-              <w:t>Disp Date</w:t>
+              <w:t>Disp</w:t>
+            </w:r>
+            <w:proofErr w:type="spellEnd"/>
+            <w:r>
+              <w:rPr>
+                <w:b/>
+              </w:rPr>
+              <w:t xml:space="preserve"> Date</w:t>
             </w:r>
           </w:p>
         </w:tc>
         <w:tc>
           <w:tcPr>
             <w:tcW w:w="3425" w:type="dxa"/>
+            <w:gridSpan w:val="2"/>
             <w:tcBorders>
               <w:top w:val="single" w:sz="4" w:space="0" w:color="000001"/>
               <w:left w:val="single" w:sz="4" w:space="0" w:color="000001"/>
@@ -3562,7 +4679,7 @@
         <w:tc>
           <w:tcPr>
             <w:tcW w:w="10779" w:type="dxa"/>
-            <w:gridSpan w:val="8"/>
+            <w:gridSpan w:val="9"/>
             <w:tcBorders>
               <w:top w:val="single" w:sz="4" w:space="0" w:color="000001"/>
               <w:left w:val="single" w:sz="4" w:space="0" w:color="000001"/>
@@ -3578,6 +4695,7 @@
               <w:ind w:left="100" w:right="-20"/>
             </w:pPr>
             <w:r>
+              <w:lastRenderedPageBreak/>
               <w:t>{%tr for charge in charges %}</w:t>
             </w:r>
           </w:p>
@@ -3590,7 +4708,7 @@
         </w:trPr>
         <w:tc>
           <w:tcPr>
-            <w:tcW w:w="2136" w:type="dxa"/>
+            <w:tcW w:w="1966" w:type="dxa"/>
             <w:tcBorders>
               <w:top w:val="single" w:sz="4" w:space="0" w:color="000001"/>
               <w:left w:val="single" w:sz="4" w:space="0" w:color="000001"/>
@@ -3606,14 +4724,21 @@
               <w:ind w:left="100" w:right="-20"/>
             </w:pPr>
             <w:r>
-              <w:lastRenderedPageBreak/>
-              <w:t>{{ charge.statute }}</w:t>
+              <w:t xml:space="preserve">{{ </w:t>
+            </w:r>
+            <w:proofErr w:type="spellStart"/>
+            <w:r>
+              <w:t>charge.statute</w:t>
+            </w:r>
+            <w:proofErr w:type="spellEnd"/>
+            <w:r>
+              <w:t xml:space="preserve"> }}</w:t>
             </w:r>
           </w:p>
         </w:tc>
         <w:tc>
           <w:tcPr>
-            <w:tcW w:w="2791" w:type="dxa"/>
+            <w:tcW w:w="2790" w:type="dxa"/>
             <w:gridSpan w:val="2"/>
             <w:tcBorders>
               <w:top w:val="single" w:sz="4" w:space="0" w:color="000001"/>
@@ -3630,13 +4755,21 @@
               <w:ind w:left="100" w:right="-20"/>
             </w:pPr>
             <w:r>
-              <w:t>{{ charge.description }}</w:t>
+              <w:t xml:space="preserve">{{ </w:t>
+            </w:r>
+            <w:proofErr w:type="spellStart"/>
+            <w:r>
+              <w:t>charge.description</w:t>
+            </w:r>
+            <w:proofErr w:type="spellEnd"/>
+            <w:r>
+              <w:t xml:space="preserve"> }}</w:t>
             </w:r>
           </w:p>
         </w:tc>
         <w:tc>
           <w:tcPr>
-            <w:tcW w:w="720" w:type="dxa"/>
+            <w:tcW w:w="891" w:type="dxa"/>
             <w:gridSpan w:val="2"/>
             <w:tcBorders>
               <w:top w:val="single" w:sz="4" w:space="0" w:color="000001"/>
@@ -3653,7 +4786,15 @@
               <w:ind w:left="100" w:right="-20"/>
             </w:pPr>
             <w:r>
-              <w:t>{{ charge.grade }}</w:t>
+              <w:t xml:space="preserve">{{ </w:t>
+            </w:r>
+            <w:proofErr w:type="spellStart"/>
+            <w:r>
+              <w:t>charge.grade</w:t>
+            </w:r>
+            <w:proofErr w:type="spellEnd"/>
+            <w:r>
+              <w:t xml:space="preserve"> }}</w:t>
             </w:r>
           </w:p>
         </w:tc>
@@ -3676,13 +4817,22 @@
               <w:ind w:left="100" w:right="-20"/>
             </w:pPr>
             <w:r>
-              <w:t>{{ charge.date|date }}</w:t>
+              <w:t xml:space="preserve">{{ </w:t>
+            </w:r>
+            <w:proofErr w:type="spellStart"/>
+            <w:r>
+              <w:t>charge.date|date</w:t>
+            </w:r>
+            <w:proofErr w:type="spellEnd"/>
+            <w:r>
+              <w:t xml:space="preserve"> }}</w:t>
             </w:r>
           </w:p>
         </w:tc>
         <w:tc>
           <w:tcPr>
             <w:tcW w:w="3425" w:type="dxa"/>
+            <w:gridSpan w:val="2"/>
             <w:tcBorders>
               <w:top w:val="single" w:sz="4" w:space="0" w:color="000001"/>
               <w:left w:val="single" w:sz="4" w:space="0" w:color="000001"/>
@@ -3698,7 +4848,15 @@
               <w:ind w:left="100" w:right="-20"/>
             </w:pPr>
             <w:r>
-              <w:t>{{ charge.disposition }}</w:t>
+              <w:t xml:space="preserve">{{ </w:t>
+            </w:r>
+            <w:proofErr w:type="spellStart"/>
+            <w:r>
+              <w:t>charge.disposition</w:t>
+            </w:r>
+            <w:proofErr w:type="spellEnd"/>
+            <w:r>
+              <w:t xml:space="preserve"> }}</w:t>
             </w:r>
           </w:p>
         </w:tc>
@@ -3711,7 +4869,7 @@
         <w:tc>
           <w:tcPr>
             <w:tcW w:w="10779" w:type="dxa"/>
-            <w:gridSpan w:val="8"/>
+            <w:gridSpan w:val="9"/>
             <w:tcBorders>
               <w:top w:val="single" w:sz="4" w:space="0" w:color="000001"/>
               <w:left w:val="single" w:sz="4" w:space="0" w:color="000001"/>
@@ -3727,7 +4885,15 @@
               <w:ind w:left="100" w:right="-20"/>
             </w:pPr>
             <w:r>
-              <w:t>{%tr endfor %}</w:t>
+              <w:t xml:space="preserve">{%tr </w:t>
+            </w:r>
+            <w:proofErr w:type="spellStart"/>
+            <w:r>
+              <w:t>endfor</w:t>
+            </w:r>
+            <w:proofErr w:type="spellEnd"/>
+            <w:r>
+              <w:t xml:space="preserve"> %}</w:t>
             </w:r>
           </w:p>
         </w:tc>
@@ -3739,7 +4905,7 @@
         <w:tc>
           <w:tcPr>
             <w:tcW w:w="10779" w:type="dxa"/>
-            <w:gridSpan w:val="8"/>
+            <w:gridSpan w:val="9"/>
             <w:tcBorders>
               <w:top w:val="single" w:sz="4" w:space="0" w:color="000001"/>
               <w:left w:val="single" w:sz="4" w:space="0" w:color="000001"/>
@@ -3755,7 +4921,23 @@
               <w:ind w:left="55"/>
             </w:pPr>
             <w:r>
-              <w:t>{%p if fines.total and fines.paid %}</w:t>
+              <w:t xml:space="preserve">{%p if </w:t>
+            </w:r>
+            <w:proofErr w:type="spellStart"/>
+            <w:r>
+              <w:t>fines.total</w:t>
+            </w:r>
+            <w:proofErr w:type="spellEnd"/>
+            <w:r>
+              <w:t xml:space="preserve"> and </w:t>
+            </w:r>
+            <w:proofErr w:type="spellStart"/>
+            <w:r>
+              <w:t>fines.paid</w:t>
+            </w:r>
+            <w:proofErr w:type="spellEnd"/>
+            <w:r>
+              <w:t xml:space="preserve"> %}</w:t>
             </w:r>
           </w:p>
           <w:p>
@@ -3765,7 +4947,23 @@
               <w:ind w:left="55"/>
             </w:pPr>
             <w:r>
-              <w:t>The Petitioner’s sentence includes fines, costs and/or restitution in the amount of ${{ fines.total }} and ${{ fines.paid }} has been paid off/adjusted.</w:t>
+              <w:t xml:space="preserve">The Petitioner’s sentence includes fines, costs and/or restitution in the amount of ${{ </w:t>
+            </w:r>
+            <w:proofErr w:type="spellStart"/>
+            <w:r>
+              <w:t>fines.total</w:t>
+            </w:r>
+            <w:proofErr w:type="spellEnd"/>
+            <w:r>
+              <w:t xml:space="preserve"> }} and ${{ </w:t>
+            </w:r>
+            <w:proofErr w:type="spellStart"/>
+            <w:r>
+              <w:t>fines.paid</w:t>
+            </w:r>
+            <w:proofErr w:type="spellEnd"/>
+            <w:r>
+              <w:t xml:space="preserve"> }} has been paid off/adjusted.</w:t>
             </w:r>
           </w:p>
           <w:p>
@@ -3800,7 +4998,7 @@
         <w:tc>
           <w:tcPr>
             <w:tcW w:w="10779" w:type="dxa"/>
-            <w:gridSpan w:val="8"/>
+            <w:gridSpan w:val="9"/>
             <w:tcBorders>
               <w:top w:val="single" w:sz="8" w:space="0" w:color="000001"/>
               <w:left w:val="single" w:sz="4" w:space="0" w:color="000001"/>
@@ -3819,7 +5017,21 @@
               <w:rPr>
                 <w:b/>
               </w:rPr>
-              <w:t>List the reason(s) for the {{ petition.ratio.value }}(please attach additional sheet(s) of paper if necessary):</w:t>
+              <w:t xml:space="preserve">List the reason(s) for the {{ </w:t>
+            </w:r>
+            <w:proofErr w:type="spellStart"/>
+            <w:r>
+              <w:rPr>
+                <w:b/>
+              </w:rPr>
+              <w:t>petition.ratio.value</w:t>
+            </w:r>
+            <w:proofErr w:type="spellEnd"/>
+            <w:r>
+              <w:rPr>
+                <w:b/>
+              </w:rPr>
+              <w:t xml:space="preserve"> }}(please attach additional sheet(s) of paper if necessary):</w:t>
             </w:r>
           </w:p>
           <w:p>
@@ -3829,7 +5041,15 @@
               <w:ind w:left="102" w:right="-20"/>
             </w:pPr>
             <w:r>
-              <w:t xml:space="preserve">As a result of these arrests and subsequent photographing and fingerprinting, Petitioner has been caused to suffer embarrassment and irreparable harm and loss of job opportunities.  Expungement is proper under 18 Pa.C.S. 9122 as the charges to be expunged were </w:t>
+              <w:t xml:space="preserve">As a result of these arrests and subsequent photographing and fingerprinting, Petitioner has been caused to suffer embarrassment and irreparable harm and loss of job opportunities.  Expungement is proper under 18 </w:t>
+            </w:r>
+            <w:proofErr w:type="spellStart"/>
+            <w:r>
+              <w:t>Pa.C.S</w:t>
+            </w:r>
+            <w:proofErr w:type="spellEnd"/>
+            <w:r>
+              <w:t xml:space="preserve">. 9122 as the charges to be expunged were </w:t>
             </w:r>
             <w:r>
               <w:rPr>
@@ -3847,7 +5067,7 @@
         <w:tc>
           <w:tcPr>
             <w:tcW w:w="10779" w:type="dxa"/>
-            <w:gridSpan w:val="8"/>
+            <w:gridSpan w:val="9"/>
             <w:tcBorders>
               <w:top w:val="single" w:sz="8" w:space="0" w:color="000001"/>
               <w:left w:val="single" w:sz="4" w:space="0" w:color="000001"/>
@@ -3892,7 +5112,23 @@
           <w:sz w:val="24"/>
           <w:szCs w:val="24"/>
         </w:rPr>
-        <w:t>The facts set forth in this petition are true and correct to the best of my personal knowledge or information and belief, and are made subject to the penalties of unsworn falsification to authorities under 18 Pa.C.S. § 4904.</w:t>
+        <w:t xml:space="preserve">The facts set forth in this petition are true and correct to the best of my personal knowledge or information and belief, and are made subject to the penalties of unsworn falsification to authorities under 18 </w:t>
+      </w:r>
+      <w:proofErr w:type="spellStart"/>
+      <w:r>
+        <w:rPr>
+          <w:sz w:val="24"/>
+          <w:szCs w:val="24"/>
+        </w:rPr>
+        <w:t>Pa.C.S</w:t>
+      </w:r>
+      <w:proofErr w:type="spellEnd"/>
+      <w:r>
+        <w:rPr>
+          <w:sz w:val="24"/>
+          <w:szCs w:val="24"/>
+        </w:rPr>
+        <w:t>. § 4904.</w:t>
       </w:r>
     </w:p>
     <w:p>
@@ -3940,7 +5176,43 @@
           <w:szCs w:val="24"/>
           <w:u w:val="single"/>
         </w:rPr>
-        <w:t xml:space="preserve">/s/ {{ attorney.user.first_name }} {{ attorney.user.last_name }}   </w:t>
+        <w:t xml:space="preserve">/s/ {{ </w:t>
+      </w:r>
+      <w:proofErr w:type="spellStart"/>
+      <w:r>
+        <w:rPr>
+          <w:sz w:val="24"/>
+          <w:szCs w:val="24"/>
+          <w:u w:val="single"/>
+        </w:rPr>
+        <w:t>attorney.user.first_name</w:t>
+      </w:r>
+      <w:proofErr w:type="spellEnd"/>
+      <w:r>
+        <w:rPr>
+          <w:sz w:val="24"/>
+          <w:szCs w:val="24"/>
+          <w:u w:val="single"/>
+        </w:rPr>
+        <w:t xml:space="preserve"> }} {{ </w:t>
+      </w:r>
+      <w:proofErr w:type="spellStart"/>
+      <w:r>
+        <w:rPr>
+          <w:sz w:val="24"/>
+          <w:szCs w:val="24"/>
+          <w:u w:val="single"/>
+        </w:rPr>
+        <w:t>attorney.user.last_name</w:t>
+      </w:r>
+      <w:proofErr w:type="spellEnd"/>
+      <w:r>
+        <w:rPr>
+          <w:sz w:val="24"/>
+          <w:szCs w:val="24"/>
+          <w:u w:val="single"/>
+        </w:rPr>
+        <w:t xml:space="preserve"> }}   </w:t>
       </w:r>
     </w:p>
     <w:p>
@@ -3953,7 +5225,39 @@
           <w:sz w:val="24"/>
           <w:szCs w:val="24"/>
         </w:rPr>
-        <w:t>{{ attorney.user.first_name }} {{ attorney.user.last_name }} Esquire</w:t>
+        <w:t xml:space="preserve">{{ </w:t>
+      </w:r>
+      <w:proofErr w:type="spellStart"/>
+      <w:r>
+        <w:rPr>
+          <w:sz w:val="24"/>
+          <w:szCs w:val="24"/>
+        </w:rPr>
+        <w:t>attorney.user.first_name</w:t>
+      </w:r>
+      <w:proofErr w:type="spellEnd"/>
+      <w:r>
+        <w:rPr>
+          <w:sz w:val="24"/>
+          <w:szCs w:val="24"/>
+        </w:rPr>
+        <w:t xml:space="preserve"> }} {{ </w:t>
+      </w:r>
+      <w:proofErr w:type="spellStart"/>
+      <w:r>
+        <w:rPr>
+          <w:sz w:val="24"/>
+          <w:szCs w:val="24"/>
+        </w:rPr>
+        <w:t>attorney.user.last_name</w:t>
+      </w:r>
+      <w:proofErr w:type="spellEnd"/>
+      <w:r>
+        <w:rPr>
+          <w:sz w:val="24"/>
+          <w:szCs w:val="24"/>
+        </w:rPr>
+        <w:t xml:space="preserve"> }} Esquire</w:t>
       </w:r>
     </w:p>
     <w:p>
@@ -4004,7 +5308,23 @@
           <w:szCs w:val="24"/>
         </w:rPr>
         <w:tab/>
-        <w:t>{{ petition.date|date }}</w:t>
+        <w:t xml:space="preserve">{{ </w:t>
+      </w:r>
+      <w:proofErr w:type="spellStart"/>
+      <w:r>
+        <w:rPr>
+          <w:sz w:val="24"/>
+          <w:szCs w:val="24"/>
+        </w:rPr>
+        <w:t>petition.date|date</w:t>
+      </w:r>
+      <w:proofErr w:type="spellEnd"/>
+      <w:r>
+        <w:rPr>
+          <w:sz w:val="24"/>
+          <w:szCs w:val="24"/>
+        </w:rPr>
+        <w:t xml:space="preserve"> }}</w:t>
       </w:r>
     </w:p>
     <w:p/>
@@ -4022,7 +5342,7 @@
 </file>
 
 <file path=word/endnotes.xml><?xml version="1.0" encoding="utf-8"?>
-<w:endnotes xmlns:wpc="http://schemas.microsoft.com/office/word/2010/wordprocessingCanvas" xmlns:cx="http://schemas.microsoft.com/office/drawing/2014/chartex" xmlns:cx1="http://schemas.microsoft.com/office/drawing/2015/9/8/chartex" xmlns:cx2="http://schemas.microsoft.com/office/drawing/2015/10/21/chartex" xmlns:cx3="http://schemas.microsoft.com/office/drawing/2016/5/9/chartex" xmlns:cx4="http://schemas.microsoft.com/office/drawing/2016/5/10/chartex" xmlns:cx5="http://schemas.microsoft.com/office/drawing/2016/5/11/chartex" xmlns:cx6="http://schemas.microsoft.com/office/drawing/2016/5/12/chartex" xmlns:cx7="http://schemas.microsoft.com/office/drawing/2016/5/13/chartex" xmlns:cx8="http://schemas.microsoft.com/office/drawing/2016/5/14/chartex" xmlns:mc="http://schemas.openxmlformats.org/markup-compatibility/2006" xmlns:aink="http://schemas.microsoft.com/office/drawing/2016/ink" xmlns:am3d="http://schemas.microsoft.com/office/drawing/2017/model3d" xmlns:o="urn:schemas-microsoft-com:office:office" xmlns:oel="http://schemas.microsoft.com/office/2019/extlst" xmlns:r="http://schemas.openxmlformats.org/officeDocument/2006/relationships" xmlns:m="http://schemas.openxmlformats.org/officeDocument/2006/math" xmlns:v="urn:schemas-microsoft-com:vml" xmlns:wp14="http://schemas.microsoft.com/office/word/2010/wordprocessingDrawing" xmlns:wp="http://schemas.openxmlformats.org/drawingml/2006/wordprocessingDrawing" xmlns:w10="urn:schemas-microsoft-com:office:word" xmlns:w="http://schemas.openxmlformats.org/wordprocessingml/2006/main" xmlns:w14="http://schemas.microsoft.com/office/word/2010/wordml" xmlns:w15="http://schemas.microsoft.com/office/word/2012/wordml" xmlns:w16cex="http://schemas.microsoft.com/office/word/2018/wordml/cex" xmlns:w16cid="http://schemas.microsoft.com/office/word/2016/wordml/cid" xmlns:w16="http://schemas.microsoft.com/office/word/2018/wordml" xmlns:w16du="http://schemas.microsoft.com/office/word/2023/wordml/word16du" xmlns:w16sdtdh="http://schemas.microsoft.com/office/word/2020/wordml/sdtdatahash" xmlns:w16se="http://schemas.microsoft.com/office/word/2015/wordml/symex" xmlns:wpg="http://schemas.microsoft.com/office/word/2010/wordprocessingGroup" xmlns:wpi="http://schemas.microsoft.com/office/word/2010/wordprocessingInk" xmlns:wne="http://schemas.microsoft.com/office/word/2006/wordml" xmlns:wps="http://schemas.microsoft.com/office/word/2010/wordprocessingShape" mc:Ignorable="w14 w15 w16se w16cid w16 w16cex w16sdtdh w16du wp14">
+<w:endnotes xmlns:wpc="http://schemas.microsoft.com/office/word/2010/wordprocessingCanvas" xmlns:cx="http://schemas.microsoft.com/office/drawing/2014/chartex" xmlns:cx1="http://schemas.microsoft.com/office/drawing/2015/9/8/chartex" xmlns:cx2="http://schemas.microsoft.com/office/drawing/2015/10/21/chartex" xmlns:cx3="http://schemas.microsoft.com/office/drawing/2016/5/9/chartex" xmlns:cx4="http://schemas.microsoft.com/office/drawing/2016/5/10/chartex" xmlns:cx5="http://schemas.microsoft.com/office/drawing/2016/5/11/chartex" xmlns:cx6="http://schemas.microsoft.com/office/drawing/2016/5/12/chartex" xmlns:cx7="http://schemas.microsoft.com/office/drawing/2016/5/13/chartex" xmlns:cx8="http://schemas.microsoft.com/office/drawing/2016/5/14/chartex" xmlns:mc="http://schemas.openxmlformats.org/markup-compatibility/2006" xmlns:aink="http://schemas.microsoft.com/office/drawing/2016/ink" xmlns:am3d="http://schemas.microsoft.com/office/drawing/2017/model3d" xmlns:o="urn:schemas-microsoft-com:office:office" xmlns:oel="http://schemas.microsoft.com/office/2019/extlst" xmlns:r="http://schemas.openxmlformats.org/officeDocument/2006/relationships" xmlns:m="http://schemas.openxmlformats.org/officeDocument/2006/math" xmlns:v="urn:schemas-microsoft-com:vml" xmlns:wp14="http://schemas.microsoft.com/office/word/2010/wordprocessingDrawing" xmlns:wp="http://schemas.openxmlformats.org/drawingml/2006/wordprocessingDrawing" xmlns:w10="urn:schemas-microsoft-com:office:word" xmlns:w="http://schemas.openxmlformats.org/wordprocessingml/2006/main" xmlns:w14="http://schemas.microsoft.com/office/word/2010/wordml" xmlns:w15="http://schemas.microsoft.com/office/word/2012/wordml" xmlns:w16cex="http://schemas.microsoft.com/office/word/2018/wordml/cex" xmlns:w16cid="http://schemas.microsoft.com/office/word/2016/wordml/cid" xmlns:w16="http://schemas.microsoft.com/office/word/2018/wordml" xmlns:w16du="http://schemas.microsoft.com/office/word/2023/wordml/word16du" xmlns:w16sdtdh="http://schemas.microsoft.com/office/word/2020/wordml/sdtdatahash" xmlns:w16sdtfl="http://schemas.microsoft.com/office/word/2024/wordml/sdtformatlock" xmlns:w16se="http://schemas.microsoft.com/office/word/2015/wordml/symex" xmlns:wpg="http://schemas.microsoft.com/office/word/2010/wordprocessingGroup" xmlns:wpi="http://schemas.microsoft.com/office/word/2010/wordprocessingInk" xmlns:wne="http://schemas.microsoft.com/office/word/2006/wordml" xmlns:wps="http://schemas.microsoft.com/office/word/2010/wordprocessingShape" mc:Ignorable="w14 w15 w16se w16cid w16 w16cex w16sdtdh w16sdtfl w16du wp14">
   <w:endnote w:type="separator" w:id="-1">
     <w:p>
       <w:pPr>
@@ -4047,7 +5367,7 @@
 </file>
 
 <file path=word/footer1.xml><?xml version="1.0" encoding="utf-8"?>
-<w:ftr xmlns:wpc="http://schemas.microsoft.com/office/word/2010/wordprocessingCanvas" xmlns:cx="http://schemas.microsoft.com/office/drawing/2014/chartex" xmlns:cx1="http://schemas.microsoft.com/office/drawing/2015/9/8/chartex" xmlns:cx2="http://schemas.microsoft.com/office/drawing/2015/10/21/chartex" xmlns:cx3="http://schemas.microsoft.com/office/drawing/2016/5/9/chartex" xmlns:cx4="http://schemas.microsoft.com/office/drawing/2016/5/10/chartex" xmlns:cx5="http://schemas.microsoft.com/office/drawing/2016/5/11/chartex" xmlns:cx6="http://schemas.microsoft.com/office/drawing/2016/5/12/chartex" xmlns:cx7="http://schemas.microsoft.com/office/drawing/2016/5/13/chartex" xmlns:cx8="http://schemas.microsoft.com/office/drawing/2016/5/14/chartex" xmlns:mc="http://schemas.openxmlformats.org/markup-compatibility/2006" xmlns:aink="http://schemas.microsoft.com/office/drawing/2016/ink" xmlns:am3d="http://schemas.microsoft.com/office/drawing/2017/model3d" xmlns:o="urn:schemas-microsoft-com:office:office" xmlns:oel="http://schemas.microsoft.com/office/2019/extlst" xmlns:r="http://schemas.openxmlformats.org/officeDocument/2006/relationships" xmlns:m="http://schemas.openxmlformats.org/officeDocument/2006/math" xmlns:v="urn:schemas-microsoft-com:vml" xmlns:wp14="http://schemas.microsoft.com/office/word/2010/wordprocessingDrawing" xmlns:wp="http://schemas.openxmlformats.org/drawingml/2006/wordprocessingDrawing" xmlns:w10="urn:schemas-microsoft-com:office:word" xmlns:w="http://schemas.openxmlformats.org/wordprocessingml/2006/main" xmlns:w14="http://schemas.microsoft.com/office/word/2010/wordml" xmlns:w15="http://schemas.microsoft.com/office/word/2012/wordml" xmlns:w16cex="http://schemas.microsoft.com/office/word/2018/wordml/cex" xmlns:w16cid="http://schemas.microsoft.com/office/word/2016/wordml/cid" xmlns:w16="http://schemas.microsoft.com/office/word/2018/wordml" xmlns:w16du="http://schemas.microsoft.com/office/word/2023/wordml/word16du" xmlns:w16sdtdh="http://schemas.microsoft.com/office/word/2020/wordml/sdtdatahash" xmlns:w16se="http://schemas.microsoft.com/office/word/2015/wordml/symex" xmlns:wpg="http://schemas.microsoft.com/office/word/2010/wordprocessingGroup" xmlns:wpi="http://schemas.microsoft.com/office/word/2010/wordprocessingInk" xmlns:wne="http://schemas.microsoft.com/office/word/2006/wordml" xmlns:wps="http://schemas.microsoft.com/office/word/2010/wordprocessingShape" mc:Ignorable="w14 w15 w16se w16cid w16 w16cex w16sdtdh w16du wp14">
+<w:ftr xmlns:wpc="http://schemas.microsoft.com/office/word/2010/wordprocessingCanvas" xmlns:cx="http://schemas.microsoft.com/office/drawing/2014/chartex" xmlns:cx1="http://schemas.microsoft.com/office/drawing/2015/9/8/chartex" xmlns:cx2="http://schemas.microsoft.com/office/drawing/2015/10/21/chartex" xmlns:cx3="http://schemas.microsoft.com/office/drawing/2016/5/9/chartex" xmlns:cx4="http://schemas.microsoft.com/office/drawing/2016/5/10/chartex" xmlns:cx5="http://schemas.microsoft.com/office/drawing/2016/5/11/chartex" xmlns:cx6="http://schemas.microsoft.com/office/drawing/2016/5/12/chartex" xmlns:cx7="http://schemas.microsoft.com/office/drawing/2016/5/13/chartex" xmlns:cx8="http://schemas.microsoft.com/office/drawing/2016/5/14/chartex" xmlns:mc="http://schemas.openxmlformats.org/markup-compatibility/2006" xmlns:aink="http://schemas.microsoft.com/office/drawing/2016/ink" xmlns:am3d="http://schemas.microsoft.com/office/drawing/2017/model3d" xmlns:o="urn:schemas-microsoft-com:office:office" xmlns:oel="http://schemas.microsoft.com/office/2019/extlst" xmlns:r="http://schemas.openxmlformats.org/officeDocument/2006/relationships" xmlns:m="http://schemas.openxmlformats.org/officeDocument/2006/math" xmlns:v="urn:schemas-microsoft-com:vml" xmlns:wp14="http://schemas.microsoft.com/office/word/2010/wordprocessingDrawing" xmlns:wp="http://schemas.openxmlformats.org/drawingml/2006/wordprocessingDrawing" xmlns:w10="urn:schemas-microsoft-com:office:word" xmlns:w="http://schemas.openxmlformats.org/wordprocessingml/2006/main" xmlns:w14="http://schemas.microsoft.com/office/word/2010/wordml" xmlns:w15="http://schemas.microsoft.com/office/word/2012/wordml" xmlns:w16cex="http://schemas.microsoft.com/office/word/2018/wordml/cex" xmlns:w16cid="http://schemas.microsoft.com/office/word/2016/wordml/cid" xmlns:w16="http://schemas.microsoft.com/office/word/2018/wordml" xmlns:w16du="http://schemas.microsoft.com/office/word/2023/wordml/word16du" xmlns:w16sdtdh="http://schemas.microsoft.com/office/word/2020/wordml/sdtdatahash" xmlns:w16sdtfl="http://schemas.microsoft.com/office/word/2024/wordml/sdtformatlock" xmlns:w16se="http://schemas.microsoft.com/office/word/2015/wordml/symex" xmlns:wpg="http://schemas.microsoft.com/office/word/2010/wordprocessingGroup" xmlns:wpi="http://schemas.microsoft.com/office/word/2010/wordprocessingInk" xmlns:wne="http://schemas.microsoft.com/office/word/2006/wordml" xmlns:wps="http://schemas.microsoft.com/office/word/2010/wordprocessingShape" mc:Ignorable="w14 w15 w16se w16cid w16 w16cex w16sdtdh w16sdtfl w16du wp14">
   <w:p>
     <w:pPr>
       <w:pBdr>
@@ -4122,7 +5442,7 @@
 </file>
 
 <file path=word/footnotes.xml><?xml version="1.0" encoding="utf-8"?>
-<w:footnotes xmlns:wpc="http://schemas.microsoft.com/office/word/2010/wordprocessingCanvas" xmlns:cx="http://schemas.microsoft.com/office/drawing/2014/chartex" xmlns:cx1="http://schemas.microsoft.com/office/drawing/2015/9/8/chartex" xmlns:cx2="http://schemas.microsoft.com/office/drawing/2015/10/21/chartex" xmlns:cx3="http://schemas.microsoft.com/office/drawing/2016/5/9/chartex" xmlns:cx4="http://schemas.microsoft.com/office/drawing/2016/5/10/chartex" xmlns:cx5="http://schemas.microsoft.com/office/drawing/2016/5/11/chartex" xmlns:cx6="http://schemas.microsoft.com/office/drawing/2016/5/12/chartex" xmlns:cx7="http://schemas.microsoft.com/office/drawing/2016/5/13/chartex" xmlns:cx8="http://schemas.microsoft.com/office/drawing/2016/5/14/chartex" xmlns:mc="http://schemas.openxmlformats.org/markup-compatibility/2006" xmlns:aink="http://schemas.microsoft.com/office/drawing/2016/ink" xmlns:am3d="http://schemas.microsoft.com/office/drawing/2017/model3d" xmlns:o="urn:schemas-microsoft-com:office:office" xmlns:oel="http://schemas.microsoft.com/office/2019/extlst" xmlns:r="http://schemas.openxmlformats.org/officeDocument/2006/relationships" xmlns:m="http://schemas.openxmlformats.org/officeDocument/2006/math" xmlns:v="urn:schemas-microsoft-com:vml" xmlns:wp14="http://schemas.microsoft.com/office/word/2010/wordprocessingDrawing" xmlns:wp="http://schemas.openxmlformats.org/drawingml/2006/wordprocessingDrawing" xmlns:w10="urn:schemas-microsoft-com:office:word" xmlns:w="http://schemas.openxmlformats.org/wordprocessingml/2006/main" xmlns:w14="http://schemas.microsoft.com/office/word/2010/wordml" xmlns:w15="http://schemas.microsoft.com/office/word/2012/wordml" xmlns:w16cex="http://schemas.microsoft.com/office/word/2018/wordml/cex" xmlns:w16cid="http://schemas.microsoft.com/office/word/2016/wordml/cid" xmlns:w16="http://schemas.microsoft.com/office/word/2018/wordml" xmlns:w16du="http://schemas.microsoft.com/office/word/2023/wordml/word16du" xmlns:w16sdtdh="http://schemas.microsoft.com/office/word/2020/wordml/sdtdatahash" xmlns:w16se="http://schemas.microsoft.com/office/word/2015/wordml/symex" xmlns:wpg="http://schemas.microsoft.com/office/word/2010/wordprocessingGroup" xmlns:wpi="http://schemas.microsoft.com/office/word/2010/wordprocessingInk" xmlns:wne="http://schemas.microsoft.com/office/word/2006/wordml" xmlns:wps="http://schemas.microsoft.com/office/word/2010/wordprocessingShape" mc:Ignorable="w14 w15 w16se w16cid w16 w16cex w16sdtdh w16du wp14">
+<w:footnotes xmlns:wpc="http://schemas.microsoft.com/office/word/2010/wordprocessingCanvas" xmlns:cx="http://schemas.microsoft.com/office/drawing/2014/chartex" xmlns:cx1="http://schemas.microsoft.com/office/drawing/2015/9/8/chartex" xmlns:cx2="http://schemas.microsoft.com/office/drawing/2015/10/21/chartex" xmlns:cx3="http://schemas.microsoft.com/office/drawing/2016/5/9/chartex" xmlns:cx4="http://schemas.microsoft.com/office/drawing/2016/5/10/chartex" xmlns:cx5="http://schemas.microsoft.com/office/drawing/2016/5/11/chartex" xmlns:cx6="http://schemas.microsoft.com/office/drawing/2016/5/12/chartex" xmlns:cx7="http://schemas.microsoft.com/office/drawing/2016/5/13/chartex" xmlns:cx8="http://schemas.microsoft.com/office/drawing/2016/5/14/chartex" xmlns:mc="http://schemas.openxmlformats.org/markup-compatibility/2006" xmlns:aink="http://schemas.microsoft.com/office/drawing/2016/ink" xmlns:am3d="http://schemas.microsoft.com/office/drawing/2017/model3d" xmlns:o="urn:schemas-microsoft-com:office:office" xmlns:oel="http://schemas.microsoft.com/office/2019/extlst" xmlns:r="http://schemas.openxmlformats.org/officeDocument/2006/relationships" xmlns:m="http://schemas.openxmlformats.org/officeDocument/2006/math" xmlns:v="urn:schemas-microsoft-com:vml" xmlns:wp14="http://schemas.microsoft.com/office/word/2010/wordprocessingDrawing" xmlns:wp="http://schemas.openxmlformats.org/drawingml/2006/wordprocessingDrawing" xmlns:w10="urn:schemas-microsoft-com:office:word" xmlns:w="http://schemas.openxmlformats.org/wordprocessingml/2006/main" xmlns:w14="http://schemas.microsoft.com/office/word/2010/wordml" xmlns:w15="http://schemas.microsoft.com/office/word/2012/wordml" xmlns:w16cex="http://schemas.microsoft.com/office/word/2018/wordml/cex" xmlns:w16cid="http://schemas.microsoft.com/office/word/2016/wordml/cid" xmlns:w16="http://schemas.microsoft.com/office/word/2018/wordml" xmlns:w16du="http://schemas.microsoft.com/office/word/2023/wordml/word16du" xmlns:w16sdtdh="http://schemas.microsoft.com/office/word/2020/wordml/sdtdatahash" xmlns:w16sdtfl="http://schemas.microsoft.com/office/word/2024/wordml/sdtformatlock" xmlns:w16se="http://schemas.microsoft.com/office/word/2015/wordml/symex" xmlns:wpg="http://schemas.microsoft.com/office/word/2010/wordprocessingGroup" xmlns:wpi="http://schemas.microsoft.com/office/word/2010/wordprocessingInk" xmlns:wne="http://schemas.microsoft.com/office/word/2006/wordml" xmlns:wps="http://schemas.microsoft.com/office/word/2010/wordprocessingShape" mc:Ignorable="w14 w15 w16se w16cid w16 w16cex w16sdtdh w16sdtfl w16du wp14">
   <w:footnote w:type="separator" w:id="-1">
     <w:p>
       <w:pPr>
@@ -4147,7 +5467,7 @@
 </file>
 
 <file path=word/header1.xml><?xml version="1.0" encoding="utf-8"?>
-<w:hdr xmlns:wpc="http://schemas.microsoft.com/office/word/2010/wordprocessingCanvas" xmlns:cx="http://schemas.microsoft.com/office/drawing/2014/chartex" xmlns:cx1="http://schemas.microsoft.com/office/drawing/2015/9/8/chartex" xmlns:cx2="http://schemas.microsoft.com/office/drawing/2015/10/21/chartex" xmlns:cx3="http://schemas.microsoft.com/office/drawing/2016/5/9/chartex" xmlns:cx4="http://schemas.microsoft.com/office/drawing/2016/5/10/chartex" xmlns:cx5="http://schemas.microsoft.com/office/drawing/2016/5/11/chartex" xmlns:cx6="http://schemas.microsoft.com/office/drawing/2016/5/12/chartex" xmlns:cx7="http://schemas.microsoft.com/office/drawing/2016/5/13/chartex" xmlns:cx8="http://schemas.microsoft.com/office/drawing/2016/5/14/chartex" xmlns:mc="http://schemas.openxmlformats.org/markup-compatibility/2006" xmlns:aink="http://schemas.microsoft.com/office/drawing/2016/ink" xmlns:am3d="http://schemas.microsoft.com/office/drawing/2017/model3d" xmlns:o="urn:schemas-microsoft-com:office:office" xmlns:oel="http://schemas.microsoft.com/office/2019/extlst" xmlns:r="http://schemas.openxmlformats.org/officeDocument/2006/relationships" xmlns:m="http://schemas.openxmlformats.org/officeDocument/2006/math" xmlns:v="urn:schemas-microsoft-com:vml" xmlns:wp14="http://schemas.microsoft.com/office/word/2010/wordprocessingDrawing" xmlns:wp="http://schemas.openxmlformats.org/drawingml/2006/wordprocessingDrawing" xmlns:w10="urn:schemas-microsoft-com:office:word" xmlns:w="http://schemas.openxmlformats.org/wordprocessingml/2006/main" xmlns:w14="http://schemas.microsoft.com/office/word/2010/wordml" xmlns:w15="http://schemas.microsoft.com/office/word/2012/wordml" xmlns:w16cex="http://schemas.microsoft.com/office/word/2018/wordml/cex" xmlns:w16cid="http://schemas.microsoft.com/office/word/2016/wordml/cid" xmlns:w16="http://schemas.microsoft.com/office/word/2018/wordml" xmlns:w16du="http://schemas.microsoft.com/office/word/2023/wordml/word16du" xmlns:w16sdtdh="http://schemas.microsoft.com/office/word/2020/wordml/sdtdatahash" xmlns:w16se="http://schemas.microsoft.com/office/word/2015/wordml/symex" xmlns:wpg="http://schemas.microsoft.com/office/word/2010/wordprocessingGroup" xmlns:wpi="http://schemas.microsoft.com/office/word/2010/wordprocessingInk" xmlns:wne="http://schemas.microsoft.com/office/word/2006/wordml" xmlns:wps="http://schemas.microsoft.com/office/word/2010/wordprocessingShape" mc:Ignorable="w14 w15 w16se w16cid w16 w16cex w16sdtdh w16du wp14">
+<w:hdr xmlns:wpc="http://schemas.microsoft.com/office/word/2010/wordprocessingCanvas" xmlns:cx="http://schemas.microsoft.com/office/drawing/2014/chartex" xmlns:cx1="http://schemas.microsoft.com/office/drawing/2015/9/8/chartex" xmlns:cx2="http://schemas.microsoft.com/office/drawing/2015/10/21/chartex" xmlns:cx3="http://schemas.microsoft.com/office/drawing/2016/5/9/chartex" xmlns:cx4="http://schemas.microsoft.com/office/drawing/2016/5/10/chartex" xmlns:cx5="http://schemas.microsoft.com/office/drawing/2016/5/11/chartex" xmlns:cx6="http://schemas.microsoft.com/office/drawing/2016/5/12/chartex" xmlns:cx7="http://schemas.microsoft.com/office/drawing/2016/5/13/chartex" xmlns:cx8="http://schemas.microsoft.com/office/drawing/2016/5/14/chartex" xmlns:mc="http://schemas.openxmlformats.org/markup-compatibility/2006" xmlns:aink="http://schemas.microsoft.com/office/drawing/2016/ink" xmlns:am3d="http://schemas.microsoft.com/office/drawing/2017/model3d" xmlns:o="urn:schemas-microsoft-com:office:office" xmlns:oel="http://schemas.microsoft.com/office/2019/extlst" xmlns:r="http://schemas.openxmlformats.org/officeDocument/2006/relationships" xmlns:m="http://schemas.openxmlformats.org/officeDocument/2006/math" xmlns:v="urn:schemas-microsoft-com:vml" xmlns:wp14="http://schemas.microsoft.com/office/word/2010/wordprocessingDrawing" xmlns:wp="http://schemas.openxmlformats.org/drawingml/2006/wordprocessingDrawing" xmlns:w10="urn:schemas-microsoft-com:office:word" xmlns:w="http://schemas.openxmlformats.org/wordprocessingml/2006/main" xmlns:w14="http://schemas.microsoft.com/office/word/2010/wordml" xmlns:w15="http://schemas.microsoft.com/office/word/2012/wordml" xmlns:w16cex="http://schemas.microsoft.com/office/word/2018/wordml/cex" xmlns:w16cid="http://schemas.microsoft.com/office/word/2016/wordml/cid" xmlns:w16="http://schemas.microsoft.com/office/word/2018/wordml" xmlns:w16du="http://schemas.microsoft.com/office/word/2023/wordml/word16du" xmlns:w16sdtdh="http://schemas.microsoft.com/office/word/2020/wordml/sdtdatahash" xmlns:w16sdtfl="http://schemas.microsoft.com/office/word/2024/wordml/sdtformatlock" xmlns:w16se="http://schemas.microsoft.com/office/word/2015/wordml/symex" xmlns:wpg="http://schemas.microsoft.com/office/word/2010/wordprocessingGroup" xmlns:wpi="http://schemas.microsoft.com/office/word/2010/wordprocessingInk" xmlns:wne="http://schemas.microsoft.com/office/word/2006/wordml" xmlns:wps="http://schemas.microsoft.com/office/word/2010/wordprocessingShape" mc:Ignorable="w14 w15 w16se w16cid w16 w16cex w16sdtdh w16sdtfl w16du wp14">
   <w:p>
     <w:pPr>
       <w:pBdr>
@@ -4171,7 +5491,7 @@
 </file>
 
 <file path=word/numbering.xml><?xml version="1.0" encoding="utf-8"?>
-<w:numbering xmlns:wpc="http://schemas.microsoft.com/office/word/2010/wordprocessingCanvas" xmlns:cx="http://schemas.microsoft.com/office/drawing/2014/chartex" xmlns:cx1="http://schemas.microsoft.com/office/drawing/2015/9/8/chartex" xmlns:cx2="http://schemas.microsoft.com/office/drawing/2015/10/21/chartex" xmlns:cx3="http://schemas.microsoft.com/office/drawing/2016/5/9/chartex" xmlns:cx4="http://schemas.microsoft.com/office/drawing/2016/5/10/chartex" xmlns:cx5="http://schemas.microsoft.com/office/drawing/2016/5/11/chartex" xmlns:cx6="http://schemas.microsoft.com/office/drawing/2016/5/12/chartex" xmlns:cx7="http://schemas.microsoft.com/office/drawing/2016/5/13/chartex" xmlns:cx8="http://schemas.microsoft.com/office/drawing/2016/5/14/chartex" xmlns:mc="http://schemas.openxmlformats.org/markup-compatibility/2006" xmlns:aink="http://schemas.microsoft.com/office/drawing/2016/ink" xmlns:am3d="http://schemas.microsoft.com/office/drawing/2017/model3d" xmlns:o="urn:schemas-microsoft-com:office:office" xmlns:oel="http://schemas.microsoft.com/office/2019/extlst" xmlns:r="http://schemas.openxmlformats.org/officeDocument/2006/relationships" xmlns:m="http://schemas.openxmlformats.org/officeDocument/2006/math" xmlns:v="urn:schemas-microsoft-com:vml" xmlns:wp14="http://schemas.microsoft.com/office/word/2010/wordprocessingDrawing" xmlns:wp="http://schemas.openxmlformats.org/drawingml/2006/wordprocessingDrawing" xmlns:w10="urn:schemas-microsoft-com:office:word" xmlns:w="http://schemas.openxmlformats.org/wordprocessingml/2006/main" xmlns:w14="http://schemas.microsoft.com/office/word/2010/wordml" xmlns:w15="http://schemas.microsoft.com/office/word/2012/wordml" xmlns:w16cex="http://schemas.microsoft.com/office/word/2018/wordml/cex" xmlns:w16cid="http://schemas.microsoft.com/office/word/2016/wordml/cid" xmlns:w16="http://schemas.microsoft.com/office/word/2018/wordml" xmlns:w16du="http://schemas.microsoft.com/office/word/2023/wordml/word16du" xmlns:w16sdtdh="http://schemas.microsoft.com/office/word/2020/wordml/sdtdatahash" xmlns:w16se="http://schemas.microsoft.com/office/word/2015/wordml/symex" xmlns:wpg="http://schemas.microsoft.com/office/word/2010/wordprocessingGroup" xmlns:wpi="http://schemas.microsoft.com/office/word/2010/wordprocessingInk" xmlns:wne="http://schemas.microsoft.com/office/word/2006/wordml" xmlns:wps="http://schemas.microsoft.com/office/word/2010/wordprocessingShape" mc:Ignorable="w14 w15 w16se w16cid w16 w16cex w16sdtdh w16du wp14">
+<w:numbering xmlns:wpc="http://schemas.microsoft.com/office/word/2010/wordprocessingCanvas" xmlns:cx="http://schemas.microsoft.com/office/drawing/2014/chartex" xmlns:cx1="http://schemas.microsoft.com/office/drawing/2015/9/8/chartex" xmlns:cx2="http://schemas.microsoft.com/office/drawing/2015/10/21/chartex" xmlns:cx3="http://schemas.microsoft.com/office/drawing/2016/5/9/chartex" xmlns:cx4="http://schemas.microsoft.com/office/drawing/2016/5/10/chartex" xmlns:cx5="http://schemas.microsoft.com/office/drawing/2016/5/11/chartex" xmlns:cx6="http://schemas.microsoft.com/office/drawing/2016/5/12/chartex" xmlns:cx7="http://schemas.microsoft.com/office/drawing/2016/5/13/chartex" xmlns:cx8="http://schemas.microsoft.com/office/drawing/2016/5/14/chartex" xmlns:mc="http://schemas.openxmlformats.org/markup-compatibility/2006" xmlns:aink="http://schemas.microsoft.com/office/drawing/2016/ink" xmlns:am3d="http://schemas.microsoft.com/office/drawing/2017/model3d" xmlns:o="urn:schemas-microsoft-com:office:office" xmlns:oel="http://schemas.microsoft.com/office/2019/extlst" xmlns:r="http://schemas.openxmlformats.org/officeDocument/2006/relationships" xmlns:m="http://schemas.openxmlformats.org/officeDocument/2006/math" xmlns:v="urn:schemas-microsoft-com:vml" xmlns:wp14="http://schemas.microsoft.com/office/word/2010/wordprocessingDrawing" xmlns:wp="http://schemas.openxmlformats.org/drawingml/2006/wordprocessingDrawing" xmlns:w10="urn:schemas-microsoft-com:office:word" xmlns:w="http://schemas.openxmlformats.org/wordprocessingml/2006/main" xmlns:w14="http://schemas.microsoft.com/office/word/2010/wordml" xmlns:w15="http://schemas.microsoft.com/office/word/2012/wordml" xmlns:w16cex="http://schemas.microsoft.com/office/word/2018/wordml/cex" xmlns:w16cid="http://schemas.microsoft.com/office/word/2016/wordml/cid" xmlns:w16="http://schemas.microsoft.com/office/word/2018/wordml" xmlns:w16du="http://schemas.microsoft.com/office/word/2023/wordml/word16du" xmlns:w16sdtdh="http://schemas.microsoft.com/office/word/2020/wordml/sdtdatahash" xmlns:w16sdtfl="http://schemas.microsoft.com/office/word/2024/wordml/sdtformatlock" xmlns:w16se="http://schemas.microsoft.com/office/word/2015/wordml/symex" xmlns:wpg="http://schemas.microsoft.com/office/word/2010/wordprocessingGroup" xmlns:wpi="http://schemas.microsoft.com/office/word/2010/wordprocessingInk" xmlns:wne="http://schemas.microsoft.com/office/word/2006/wordml" xmlns:wps="http://schemas.microsoft.com/office/word/2010/wordprocessingShape" mc:Ignorable="w14 w15 w16se w16cid w16 w16cex w16sdtdh w16sdtfl w16du wp14">
   <w:abstractNum w:abstractNumId="0" w15:restartNumberingAfterBreak="0">
     <w:nsid w:val="1C883117"/>
     <w:multiLevelType w:val="multilevel"/>
@@ -4364,7 +5684,7 @@
 </file>
 
 <file path=word/styles.xml><?xml version="1.0" encoding="utf-8"?>
-<w:styles xmlns:mc="http://schemas.openxmlformats.org/markup-compatibility/2006" xmlns:r="http://schemas.openxmlformats.org/officeDocument/2006/relationships" xmlns:w="http://schemas.openxmlformats.org/wordprocessingml/2006/main" xmlns:w14="http://schemas.microsoft.com/office/word/2010/wordml" xmlns:w15="http://schemas.microsoft.com/office/word/2012/wordml" xmlns:w16cex="http://schemas.microsoft.com/office/word/2018/wordml/cex" xmlns:w16cid="http://schemas.microsoft.com/office/word/2016/wordml/cid" xmlns:w16="http://schemas.microsoft.com/office/word/2018/wordml" xmlns:w16du="http://schemas.microsoft.com/office/word/2023/wordml/word16du" xmlns:w16sdtdh="http://schemas.microsoft.com/office/word/2020/wordml/sdtdatahash" xmlns:w16se="http://schemas.microsoft.com/office/word/2015/wordml/symex" mc:Ignorable="w14 w15 w16se w16cid w16 w16cex w16sdtdh w16du">
+<w:styles xmlns:mc="http://schemas.openxmlformats.org/markup-compatibility/2006" xmlns:r="http://schemas.openxmlformats.org/officeDocument/2006/relationships" xmlns:w="http://schemas.openxmlformats.org/wordprocessingml/2006/main" xmlns:w14="http://schemas.microsoft.com/office/word/2010/wordml" xmlns:w15="http://schemas.microsoft.com/office/word/2012/wordml" xmlns:w16cex="http://schemas.microsoft.com/office/word/2018/wordml/cex" xmlns:w16cid="http://schemas.microsoft.com/office/word/2016/wordml/cid" xmlns:w16="http://schemas.microsoft.com/office/word/2018/wordml" xmlns:w16du="http://schemas.microsoft.com/office/word/2023/wordml/word16du" xmlns:w16sdtdh="http://schemas.microsoft.com/office/word/2020/wordml/sdtdatahash" xmlns:w16sdtfl="http://schemas.microsoft.com/office/word/2024/wordml/sdtformatlock" xmlns:w16se="http://schemas.microsoft.com/office/word/2015/wordml/symex" mc:Ignorable="w14 w15 w16se w16cid w16 w16cex w16sdtdh w16sdtfl w16du">
   <w:docDefaults>
     <w:rPrDefault>
       <w:rPr>

</xml_diff>